<commit_message>
Module 2 Initial commit
</commit_message>
<xml_diff>
--- a/postman/API_Test_Evidence.docx
+++ b/postman/API_Test_Evidence.docx
@@ -31,7 +31,19 @@
         <w:rPr>
           <w:b/>
         </w:rPr>
-        <w:t>Postman test evidence for the Microservices Fundamentals Module 1 changes.</w:t>
+        <w:t xml:space="preserve">Postman test evidence for the Microservices Fundamentals Module </w:t>
+      </w:r>
+      <w:r>
+        <w:rPr>
+          <w:b/>
+        </w:rPr>
+        <w:t>1</w:t>
+      </w:r>
+      <w:r>
+        <w:rPr>
+          <w:b/>
+        </w:rPr>
+        <w:t xml:space="preserve"> changes.</w:t>
       </w:r>
     </w:p>
     <w:p>
@@ -41,7 +53,7 @@
       </w:pPr>
       <w:r>
         <w:rPr/>
-        <w:t>Resource files are stored in S3 (LocalStack) and the database keeps only the file key. Upload no longer calls the Song Service, so two requests were added to create song metadata explicitly where a later test needs it. Delete removes the file from S3, the record from the database and the song metadata. Screenshots follow the order in which the tests were run.</w:t>
+        <w:t>Screenshots follow the order in which the tests were run.</w:t>
       </w:r>
     </w:p>
     <w:tbl>
@@ -57,7 +69,7 @@
           <w:bottom w:w="0" w:type="dxa"/>
           <w:end w:w="108" w:type="dxa"/>
         </w:tblCellMar>
-        <w:tblLook w:val="04a0" w:noHBand="0" w:noVBand="1" w:firstColumn="1" w:lastRow="0" w:lastColumn="0" w:firstRow="1"/>
+        <w:tblLook w:noHBand="0" w:noVBand="1" w:firstColumn="1" w:lastRow="0" w:lastColumn="0" w:firstRow="1" w:val="04a0"/>
       </w:tblPr>
       <w:tblGrid>
         <w:gridCol w:w="567"/>
@@ -82,6 +94,7 @@
             <w:pPr>
               <w:pStyle w:val="Normal"/>
               <w:widowControl/>
+              <w:suppressAutoHyphens w:val="true"/>
               <w:spacing w:lineRule="auto" w:line="240" w:before="20" w:after="20"/>
               <w:jc w:val="center"/>
               <w:rPr>
@@ -114,6 +127,7 @@
             <w:pPr>
               <w:pStyle w:val="Normal"/>
               <w:widowControl/>
+              <w:suppressAutoHyphens w:val="true"/>
               <w:spacing w:lineRule="auto" w:line="240" w:before="20" w:after="20"/>
               <w:jc w:val="start"/>
               <w:rPr>
@@ -146,6 +160,7 @@
             <w:pPr>
               <w:pStyle w:val="Normal"/>
               <w:widowControl/>
+              <w:suppressAutoHyphens w:val="true"/>
               <w:spacing w:lineRule="auto" w:line="240" w:before="20" w:after="20"/>
               <w:jc w:val="start"/>
               <w:rPr>
@@ -178,6 +193,7 @@
             <w:pPr>
               <w:pStyle w:val="Normal"/>
               <w:widowControl/>
+              <w:suppressAutoHyphens w:val="true"/>
               <w:spacing w:lineRule="auto" w:line="240" w:before="20" w:after="20"/>
               <w:jc w:val="center"/>
               <w:rPr>
@@ -210,6 +226,7 @@
             <w:pPr>
               <w:pStyle w:val="Normal"/>
               <w:widowControl/>
+              <w:suppressAutoHyphens w:val="true"/>
               <w:spacing w:lineRule="auto" w:line="240" w:before="20" w:after="20"/>
               <w:jc w:val="start"/>
               <w:rPr>
@@ -246,6 +263,7 @@
             <w:pPr>
               <w:pStyle w:val="Normal"/>
               <w:widowControl/>
+              <w:suppressAutoHyphens w:val="true"/>
               <w:spacing w:lineRule="auto" w:line="240" w:before="20" w:after="20"/>
               <w:jc w:val="center"/>
               <w:rPr>
@@ -277,6 +295,7 @@
             <w:pPr>
               <w:pStyle w:val="Normal"/>
               <w:widowControl/>
+              <w:suppressAutoHyphens w:val="true"/>
               <w:spacing w:lineRule="auto" w:line="240" w:before="20" w:after="20"/>
               <w:jc w:val="start"/>
               <w:rPr>
@@ -308,6 +327,7 @@
             <w:pPr>
               <w:pStyle w:val="Normal"/>
               <w:widowControl/>
+              <w:suppressAutoHyphens w:val="true"/>
               <w:spacing w:lineRule="auto" w:line="240" w:before="20" w:after="20"/>
               <w:jc w:val="start"/>
               <w:rPr>
@@ -339,6 +359,7 @@
             <w:pPr>
               <w:pStyle w:val="Normal"/>
               <w:widowControl/>
+              <w:suppressAutoHyphens w:val="true"/>
               <w:spacing w:lineRule="auto" w:line="240" w:before="20" w:after="20"/>
               <w:jc w:val="center"/>
               <w:rPr>
@@ -370,6 +391,7 @@
             <w:pPr>
               <w:pStyle w:val="Normal"/>
               <w:widowControl/>
+              <w:suppressAutoHyphens w:val="true"/>
               <w:spacing w:lineRule="auto" w:line="240" w:before="20" w:after="20"/>
               <w:jc w:val="start"/>
               <w:rPr>
@@ -406,6 +428,7 @@
             <w:pPr>
               <w:pStyle w:val="Normal"/>
               <w:widowControl/>
+              <w:suppressAutoHyphens w:val="true"/>
               <w:spacing w:lineRule="auto" w:line="240" w:before="20" w:after="20"/>
               <w:jc w:val="center"/>
               <w:rPr>
@@ -437,6 +460,7 @@
             <w:pPr>
               <w:pStyle w:val="Normal"/>
               <w:widowControl/>
+              <w:suppressAutoHyphens w:val="true"/>
               <w:spacing w:lineRule="auto" w:line="240" w:before="20" w:after="20"/>
               <w:jc w:val="start"/>
               <w:rPr>
@@ -468,6 +492,7 @@
             <w:pPr>
               <w:pStyle w:val="Normal"/>
               <w:widowControl/>
+              <w:suppressAutoHyphens w:val="true"/>
               <w:spacing w:lineRule="auto" w:line="240" w:before="20" w:after="20"/>
               <w:jc w:val="start"/>
               <w:rPr>
@@ -499,6 +524,7 @@
             <w:pPr>
               <w:pStyle w:val="Normal"/>
               <w:widowControl/>
+              <w:suppressAutoHyphens w:val="true"/>
               <w:spacing w:lineRule="auto" w:line="240" w:before="20" w:after="20"/>
               <w:jc w:val="center"/>
               <w:rPr>
@@ -530,6 +556,7 @@
             <w:pPr>
               <w:pStyle w:val="Normal"/>
               <w:widowControl/>
+              <w:suppressAutoHyphens w:val="true"/>
               <w:spacing w:lineRule="auto" w:line="240" w:before="20" w:after="20"/>
               <w:jc w:val="start"/>
               <w:rPr>
@@ -566,6 +593,7 @@
             <w:pPr>
               <w:pStyle w:val="Normal"/>
               <w:widowControl/>
+              <w:suppressAutoHyphens w:val="true"/>
               <w:spacing w:lineRule="auto" w:line="240" w:before="20" w:after="20"/>
               <w:jc w:val="center"/>
               <w:rPr>
@@ -597,6 +625,7 @@
             <w:pPr>
               <w:pStyle w:val="Normal"/>
               <w:widowControl/>
+              <w:suppressAutoHyphens w:val="true"/>
               <w:spacing w:lineRule="auto" w:line="240" w:before="20" w:after="20"/>
               <w:jc w:val="start"/>
               <w:rPr>
@@ -628,6 +657,7 @@
             <w:pPr>
               <w:pStyle w:val="Normal"/>
               <w:widowControl/>
+              <w:suppressAutoHyphens w:val="true"/>
               <w:spacing w:lineRule="auto" w:line="240" w:before="20" w:after="20"/>
               <w:jc w:val="start"/>
               <w:rPr>
@@ -659,6 +689,7 @@
             <w:pPr>
               <w:pStyle w:val="Normal"/>
               <w:widowControl/>
+              <w:suppressAutoHyphens w:val="true"/>
               <w:spacing w:lineRule="auto" w:line="240" w:before="20" w:after="20"/>
               <w:jc w:val="center"/>
               <w:rPr>
@@ -690,6 +721,7 @@
             <w:pPr>
               <w:pStyle w:val="Normal"/>
               <w:widowControl/>
+              <w:suppressAutoHyphens w:val="true"/>
               <w:spacing w:lineRule="auto" w:line="240" w:before="20" w:after="20"/>
               <w:jc w:val="start"/>
               <w:rPr>
@@ -727,6 +759,7 @@
             <w:pPr>
               <w:pStyle w:val="Normal"/>
               <w:widowControl/>
+              <w:suppressAutoHyphens w:val="true"/>
               <w:spacing w:lineRule="auto" w:line="240" w:before="20" w:after="20"/>
               <w:jc w:val="center"/>
               <w:rPr>
@@ -760,6 +793,7 @@
             <w:pPr>
               <w:pStyle w:val="Normal"/>
               <w:widowControl/>
+              <w:suppressAutoHyphens w:val="true"/>
               <w:spacing w:lineRule="auto" w:line="240" w:before="20" w:after="20"/>
               <w:jc w:val="start"/>
               <w:rPr>
@@ -793,6 +827,7 @@
             <w:pPr>
               <w:pStyle w:val="Normal"/>
               <w:widowControl/>
+              <w:suppressAutoHyphens w:val="true"/>
               <w:spacing w:lineRule="auto" w:line="240" w:before="20" w:after="20"/>
               <w:jc w:val="start"/>
               <w:rPr>
@@ -826,6 +861,7 @@
             <w:pPr>
               <w:pStyle w:val="Normal"/>
               <w:widowControl/>
+              <w:suppressAutoHyphens w:val="true"/>
               <w:spacing w:lineRule="auto" w:line="240" w:before="20" w:after="20"/>
               <w:jc w:val="center"/>
               <w:rPr>
@@ -859,6 +895,7 @@
             <w:pPr>
               <w:pStyle w:val="Normal"/>
               <w:widowControl/>
+              <w:suppressAutoHyphens w:val="true"/>
               <w:spacing w:lineRule="auto" w:line="240" w:before="20" w:after="20"/>
               <w:jc w:val="start"/>
               <w:rPr>
@@ -896,6 +933,7 @@
             <w:pPr>
               <w:pStyle w:val="Normal"/>
               <w:widowControl/>
+              <w:suppressAutoHyphens w:val="true"/>
               <w:spacing w:lineRule="auto" w:line="240" w:before="20" w:after="20"/>
               <w:jc w:val="center"/>
               <w:rPr>
@@ -927,6 +965,7 @@
             <w:pPr>
               <w:pStyle w:val="Normal"/>
               <w:widowControl/>
+              <w:suppressAutoHyphens w:val="true"/>
               <w:spacing w:lineRule="auto" w:line="240" w:before="20" w:after="20"/>
               <w:jc w:val="start"/>
               <w:rPr>
@@ -958,6 +997,7 @@
             <w:pPr>
               <w:pStyle w:val="Normal"/>
               <w:widowControl/>
+              <w:suppressAutoHyphens w:val="true"/>
               <w:spacing w:lineRule="auto" w:line="240" w:before="20" w:after="20"/>
               <w:jc w:val="start"/>
               <w:rPr>
@@ -989,6 +1029,7 @@
             <w:pPr>
               <w:pStyle w:val="Normal"/>
               <w:widowControl/>
+              <w:suppressAutoHyphens w:val="true"/>
               <w:spacing w:lineRule="auto" w:line="240" w:before="20" w:after="20"/>
               <w:jc w:val="center"/>
               <w:rPr>
@@ -1020,6 +1061,7 @@
             <w:pPr>
               <w:pStyle w:val="Normal"/>
               <w:widowControl/>
+              <w:suppressAutoHyphens w:val="true"/>
               <w:spacing w:lineRule="auto" w:line="240" w:before="20" w:after="20"/>
               <w:jc w:val="start"/>
               <w:rPr>
@@ -1056,6 +1098,7 @@
             <w:pPr>
               <w:pStyle w:val="Normal"/>
               <w:widowControl/>
+              <w:suppressAutoHyphens w:val="true"/>
               <w:spacing w:lineRule="auto" w:line="240" w:before="20" w:after="20"/>
               <w:jc w:val="center"/>
               <w:rPr>
@@ -1087,6 +1130,7 @@
             <w:pPr>
               <w:pStyle w:val="Normal"/>
               <w:widowControl/>
+              <w:suppressAutoHyphens w:val="true"/>
               <w:spacing w:lineRule="auto" w:line="240" w:before="20" w:after="20"/>
               <w:jc w:val="start"/>
               <w:rPr>
@@ -1118,6 +1162,7 @@
             <w:pPr>
               <w:pStyle w:val="Normal"/>
               <w:widowControl/>
+              <w:suppressAutoHyphens w:val="true"/>
               <w:spacing w:lineRule="auto" w:line="240" w:before="20" w:after="20"/>
               <w:jc w:val="start"/>
               <w:rPr>
@@ -1149,6 +1194,7 @@
             <w:pPr>
               <w:pStyle w:val="Normal"/>
               <w:widowControl/>
+              <w:suppressAutoHyphens w:val="true"/>
               <w:spacing w:lineRule="auto" w:line="240" w:before="20" w:after="20"/>
               <w:jc w:val="center"/>
               <w:rPr>
@@ -1180,6 +1226,7 @@
             <w:pPr>
               <w:pStyle w:val="Normal"/>
               <w:widowControl/>
+              <w:suppressAutoHyphens w:val="true"/>
               <w:spacing w:lineRule="auto" w:line="240" w:before="20" w:after="20"/>
               <w:jc w:val="start"/>
               <w:rPr>
@@ -1216,6 +1263,7 @@
             <w:pPr>
               <w:pStyle w:val="Normal"/>
               <w:widowControl/>
+              <w:suppressAutoHyphens w:val="true"/>
               <w:spacing w:lineRule="auto" w:line="240" w:before="20" w:after="20"/>
               <w:jc w:val="center"/>
               <w:rPr>
@@ -1247,6 +1295,7 @@
             <w:pPr>
               <w:pStyle w:val="Normal"/>
               <w:widowControl/>
+              <w:suppressAutoHyphens w:val="true"/>
               <w:spacing w:lineRule="auto" w:line="240" w:before="20" w:after="20"/>
               <w:jc w:val="start"/>
               <w:rPr>
@@ -1278,6 +1327,7 @@
             <w:pPr>
               <w:pStyle w:val="Normal"/>
               <w:widowControl/>
+              <w:suppressAutoHyphens w:val="true"/>
               <w:spacing w:lineRule="auto" w:line="240" w:before="20" w:after="20"/>
               <w:jc w:val="start"/>
               <w:rPr>
@@ -1309,6 +1359,7 @@
             <w:pPr>
               <w:pStyle w:val="Normal"/>
               <w:widowControl/>
+              <w:suppressAutoHyphens w:val="true"/>
               <w:spacing w:lineRule="auto" w:line="240" w:before="20" w:after="20"/>
               <w:jc w:val="center"/>
               <w:rPr>
@@ -1340,6 +1391,7 @@
             <w:pPr>
               <w:pStyle w:val="Normal"/>
               <w:widowControl/>
+              <w:suppressAutoHyphens w:val="true"/>
               <w:spacing w:lineRule="auto" w:line="240" w:before="20" w:after="20"/>
               <w:jc w:val="start"/>
               <w:rPr>
@@ -1376,6 +1428,7 @@
             <w:pPr>
               <w:pStyle w:val="Normal"/>
               <w:widowControl/>
+              <w:suppressAutoHyphens w:val="true"/>
               <w:spacing w:lineRule="auto" w:line="240" w:before="20" w:after="20"/>
               <w:jc w:val="center"/>
               <w:rPr>
@@ -1407,6 +1460,7 @@
             <w:pPr>
               <w:pStyle w:val="Normal"/>
               <w:widowControl/>
+              <w:suppressAutoHyphens w:val="true"/>
               <w:spacing w:lineRule="auto" w:line="240" w:before="20" w:after="20"/>
               <w:jc w:val="start"/>
               <w:rPr>
@@ -1438,6 +1492,7 @@
             <w:pPr>
               <w:pStyle w:val="Normal"/>
               <w:widowControl/>
+              <w:suppressAutoHyphens w:val="true"/>
               <w:spacing w:lineRule="auto" w:line="240" w:before="20" w:after="20"/>
               <w:jc w:val="start"/>
               <w:rPr>
@@ -1469,6 +1524,7 @@
             <w:pPr>
               <w:pStyle w:val="Normal"/>
               <w:widowControl/>
+              <w:suppressAutoHyphens w:val="true"/>
               <w:spacing w:lineRule="auto" w:line="240" w:before="20" w:after="20"/>
               <w:jc w:val="center"/>
               <w:rPr>
@@ -1500,6 +1556,7 @@
             <w:pPr>
               <w:pStyle w:val="Normal"/>
               <w:widowControl/>
+              <w:suppressAutoHyphens w:val="true"/>
               <w:spacing w:lineRule="auto" w:line="240" w:before="20" w:after="20"/>
               <w:jc w:val="start"/>
               <w:rPr>
@@ -1536,6 +1593,7 @@
             <w:pPr>
               <w:pStyle w:val="Normal"/>
               <w:widowControl/>
+              <w:suppressAutoHyphens w:val="true"/>
               <w:spacing w:lineRule="auto" w:line="240" w:before="20" w:after="20"/>
               <w:jc w:val="center"/>
               <w:rPr>
@@ -1567,6 +1625,7 @@
             <w:pPr>
               <w:pStyle w:val="Normal"/>
               <w:widowControl/>
+              <w:suppressAutoHyphens w:val="true"/>
               <w:spacing w:lineRule="auto" w:line="240" w:before="20" w:after="20"/>
               <w:jc w:val="start"/>
               <w:rPr>
@@ -1598,6 +1657,7 @@
             <w:pPr>
               <w:pStyle w:val="Normal"/>
               <w:widowControl/>
+              <w:suppressAutoHyphens w:val="true"/>
               <w:spacing w:lineRule="auto" w:line="240" w:before="20" w:after="20"/>
               <w:jc w:val="start"/>
               <w:rPr>
@@ -1629,6 +1689,7 @@
             <w:pPr>
               <w:pStyle w:val="Normal"/>
               <w:widowControl/>
+              <w:suppressAutoHyphens w:val="true"/>
               <w:spacing w:lineRule="auto" w:line="240" w:before="20" w:after="20"/>
               <w:jc w:val="center"/>
               <w:rPr>
@@ -1660,6 +1721,7 @@
             <w:pPr>
               <w:pStyle w:val="Normal"/>
               <w:widowControl/>
+              <w:suppressAutoHyphens w:val="true"/>
               <w:spacing w:lineRule="auto" w:line="240" w:before="20" w:after="20"/>
               <w:jc w:val="start"/>
               <w:rPr>
@@ -1696,6 +1758,7 @@
             <w:pPr>
               <w:pStyle w:val="Normal"/>
               <w:widowControl/>
+              <w:suppressAutoHyphens w:val="true"/>
               <w:spacing w:lineRule="auto" w:line="240" w:before="20" w:after="20"/>
               <w:jc w:val="center"/>
               <w:rPr>
@@ -1727,6 +1790,7 @@
             <w:pPr>
               <w:pStyle w:val="Normal"/>
               <w:widowControl/>
+              <w:suppressAutoHyphens w:val="true"/>
               <w:spacing w:lineRule="auto" w:line="240" w:before="20" w:after="20"/>
               <w:jc w:val="start"/>
               <w:rPr>
@@ -1758,6 +1822,7 @@
             <w:pPr>
               <w:pStyle w:val="Normal"/>
               <w:widowControl/>
+              <w:suppressAutoHyphens w:val="true"/>
               <w:spacing w:lineRule="auto" w:line="240" w:before="20" w:after="20"/>
               <w:jc w:val="start"/>
               <w:rPr>
@@ -1789,6 +1854,7 @@
             <w:pPr>
               <w:pStyle w:val="Normal"/>
               <w:widowControl/>
+              <w:suppressAutoHyphens w:val="true"/>
               <w:spacing w:lineRule="auto" w:line="240" w:before="20" w:after="20"/>
               <w:jc w:val="center"/>
               <w:rPr>
@@ -1820,6 +1886,7 @@
             <w:pPr>
               <w:pStyle w:val="Normal"/>
               <w:widowControl/>
+              <w:suppressAutoHyphens w:val="true"/>
               <w:spacing w:lineRule="auto" w:line="240" w:before="20" w:after="20"/>
               <w:jc w:val="start"/>
               <w:rPr>
@@ -1856,6 +1923,7 @@
             <w:pPr>
               <w:pStyle w:val="Normal"/>
               <w:widowControl/>
+              <w:suppressAutoHyphens w:val="true"/>
               <w:spacing w:lineRule="auto" w:line="240" w:before="20" w:after="20"/>
               <w:jc w:val="center"/>
               <w:rPr>
@@ -1887,6 +1955,7 @@
             <w:pPr>
               <w:pStyle w:val="Normal"/>
               <w:widowControl/>
+              <w:suppressAutoHyphens w:val="true"/>
               <w:spacing w:lineRule="auto" w:line="240" w:before="20" w:after="20"/>
               <w:jc w:val="start"/>
               <w:rPr>
@@ -1918,6 +1987,7 @@
             <w:pPr>
               <w:pStyle w:val="Normal"/>
               <w:widowControl/>
+              <w:suppressAutoHyphens w:val="true"/>
               <w:spacing w:lineRule="auto" w:line="240" w:before="20" w:after="20"/>
               <w:jc w:val="start"/>
               <w:rPr>
@@ -1949,6 +2019,7 @@
             <w:pPr>
               <w:pStyle w:val="Normal"/>
               <w:widowControl/>
+              <w:suppressAutoHyphens w:val="true"/>
               <w:spacing w:lineRule="auto" w:line="240" w:before="20" w:after="20"/>
               <w:jc w:val="center"/>
               <w:rPr>
@@ -1980,6 +2051,7 @@
             <w:pPr>
               <w:pStyle w:val="Normal"/>
               <w:widowControl/>
+              <w:suppressAutoHyphens w:val="true"/>
               <w:spacing w:lineRule="auto" w:line="240" w:before="20" w:after="20"/>
               <w:jc w:val="start"/>
               <w:rPr>
@@ -2016,6 +2088,7 @@
             <w:pPr>
               <w:pStyle w:val="Normal"/>
               <w:widowControl/>
+              <w:suppressAutoHyphens w:val="true"/>
               <w:spacing w:lineRule="auto" w:line="240" w:before="20" w:after="20"/>
               <w:jc w:val="center"/>
               <w:rPr>
@@ -2047,6 +2120,7 @@
             <w:pPr>
               <w:pStyle w:val="Normal"/>
               <w:widowControl/>
+              <w:suppressAutoHyphens w:val="true"/>
               <w:spacing w:lineRule="auto" w:line="240" w:before="20" w:after="20"/>
               <w:jc w:val="start"/>
               <w:rPr>
@@ -2078,6 +2152,7 @@
             <w:pPr>
               <w:pStyle w:val="Normal"/>
               <w:widowControl/>
+              <w:suppressAutoHyphens w:val="true"/>
               <w:spacing w:lineRule="auto" w:line="240" w:before="20" w:after="20"/>
               <w:jc w:val="start"/>
               <w:rPr>
@@ -2109,6 +2184,7 @@
             <w:pPr>
               <w:pStyle w:val="Normal"/>
               <w:widowControl/>
+              <w:suppressAutoHyphens w:val="true"/>
               <w:spacing w:lineRule="auto" w:line="240" w:before="20" w:after="20"/>
               <w:jc w:val="center"/>
               <w:rPr>
@@ -2140,6 +2216,7 @@
             <w:pPr>
               <w:pStyle w:val="Normal"/>
               <w:widowControl/>
+              <w:suppressAutoHyphens w:val="true"/>
               <w:spacing w:lineRule="auto" w:line="240" w:before="20" w:after="20"/>
               <w:jc w:val="start"/>
               <w:rPr>
@@ -2176,6 +2253,7 @@
             <w:pPr>
               <w:pStyle w:val="Normal"/>
               <w:widowControl/>
+              <w:suppressAutoHyphens w:val="true"/>
               <w:spacing w:lineRule="auto" w:line="240" w:before="20" w:after="20"/>
               <w:jc w:val="center"/>
               <w:rPr>
@@ -2207,6 +2285,7 @@
             <w:pPr>
               <w:pStyle w:val="Normal"/>
               <w:widowControl/>
+              <w:suppressAutoHyphens w:val="true"/>
               <w:spacing w:lineRule="auto" w:line="240" w:before="20" w:after="20"/>
               <w:jc w:val="start"/>
               <w:rPr>
@@ -2238,6 +2317,7 @@
             <w:pPr>
               <w:pStyle w:val="Normal"/>
               <w:widowControl/>
+              <w:suppressAutoHyphens w:val="true"/>
               <w:spacing w:lineRule="auto" w:line="240" w:before="20" w:after="20"/>
               <w:jc w:val="start"/>
               <w:rPr>
@@ -2269,6 +2349,7 @@
             <w:pPr>
               <w:pStyle w:val="Normal"/>
               <w:widowControl/>
+              <w:suppressAutoHyphens w:val="true"/>
               <w:spacing w:lineRule="auto" w:line="240" w:before="20" w:after="20"/>
               <w:jc w:val="center"/>
               <w:rPr>
@@ -2300,6 +2381,7 @@
             <w:pPr>
               <w:pStyle w:val="Normal"/>
               <w:widowControl/>
+              <w:suppressAutoHyphens w:val="true"/>
               <w:spacing w:lineRule="auto" w:line="240" w:before="20" w:after="20"/>
               <w:jc w:val="start"/>
               <w:rPr>
@@ -2336,6 +2418,7 @@
             <w:pPr>
               <w:pStyle w:val="Normal"/>
               <w:widowControl/>
+              <w:suppressAutoHyphens w:val="true"/>
               <w:spacing w:lineRule="auto" w:line="240" w:before="20" w:after="20"/>
               <w:jc w:val="center"/>
               <w:rPr>
@@ -2367,6 +2450,7 @@
             <w:pPr>
               <w:pStyle w:val="Normal"/>
               <w:widowControl/>
+              <w:suppressAutoHyphens w:val="true"/>
               <w:spacing w:lineRule="auto" w:line="240" w:before="20" w:after="20"/>
               <w:jc w:val="start"/>
               <w:rPr>
@@ -2398,6 +2482,7 @@
             <w:pPr>
               <w:pStyle w:val="Normal"/>
               <w:widowControl/>
+              <w:suppressAutoHyphens w:val="true"/>
               <w:spacing w:lineRule="auto" w:line="240" w:before="20" w:after="20"/>
               <w:jc w:val="start"/>
               <w:rPr>
@@ -2429,6 +2514,7 @@
             <w:pPr>
               <w:pStyle w:val="Normal"/>
               <w:widowControl/>
+              <w:suppressAutoHyphens w:val="true"/>
               <w:spacing w:lineRule="auto" w:line="240" w:before="20" w:after="20"/>
               <w:jc w:val="center"/>
               <w:rPr>
@@ -2460,6 +2546,7 @@
             <w:pPr>
               <w:pStyle w:val="Normal"/>
               <w:widowControl/>
+              <w:suppressAutoHyphens w:val="true"/>
               <w:spacing w:lineRule="auto" w:line="240" w:before="20" w:after="20"/>
               <w:jc w:val="start"/>
               <w:rPr>
@@ -2496,6 +2583,7 @@
             <w:pPr>
               <w:pStyle w:val="Normal"/>
               <w:widowControl/>
+              <w:suppressAutoHyphens w:val="true"/>
               <w:spacing w:lineRule="auto" w:line="240" w:before="20" w:after="20"/>
               <w:jc w:val="center"/>
               <w:rPr>
@@ -2527,6 +2615,7 @@
             <w:pPr>
               <w:pStyle w:val="Normal"/>
               <w:widowControl/>
+              <w:suppressAutoHyphens w:val="true"/>
               <w:spacing w:lineRule="auto" w:line="240" w:before="20" w:after="20"/>
               <w:jc w:val="start"/>
               <w:rPr>
@@ -2558,6 +2647,7 @@
             <w:pPr>
               <w:pStyle w:val="Normal"/>
               <w:widowControl/>
+              <w:suppressAutoHyphens w:val="true"/>
               <w:spacing w:lineRule="auto" w:line="240" w:before="20" w:after="20"/>
               <w:jc w:val="start"/>
               <w:rPr>
@@ -2589,6 +2679,7 @@
             <w:pPr>
               <w:pStyle w:val="Normal"/>
               <w:widowControl/>
+              <w:suppressAutoHyphens w:val="true"/>
               <w:spacing w:lineRule="auto" w:line="240" w:before="20" w:after="20"/>
               <w:jc w:val="center"/>
               <w:rPr>
@@ -2620,6 +2711,7 @@
             <w:pPr>
               <w:pStyle w:val="Normal"/>
               <w:widowControl/>
+              <w:suppressAutoHyphens w:val="true"/>
               <w:spacing w:lineRule="auto" w:line="240" w:before="20" w:after="20"/>
               <w:jc w:val="start"/>
               <w:rPr>
@@ -2656,6 +2748,7 @@
             <w:pPr>
               <w:pStyle w:val="Normal"/>
               <w:widowControl/>
+              <w:suppressAutoHyphens w:val="true"/>
               <w:spacing w:lineRule="auto" w:line="240" w:before="20" w:after="20"/>
               <w:jc w:val="center"/>
               <w:rPr>
@@ -2687,6 +2780,7 @@
             <w:pPr>
               <w:pStyle w:val="Normal"/>
               <w:widowControl/>
+              <w:suppressAutoHyphens w:val="true"/>
               <w:spacing w:lineRule="auto" w:line="240" w:before="20" w:after="20"/>
               <w:jc w:val="start"/>
               <w:rPr>
@@ -2718,6 +2812,7 @@
             <w:pPr>
               <w:pStyle w:val="Normal"/>
               <w:widowControl/>
+              <w:suppressAutoHyphens w:val="true"/>
               <w:spacing w:lineRule="auto" w:line="240" w:before="20" w:after="20"/>
               <w:jc w:val="start"/>
               <w:rPr>
@@ -2749,6 +2844,7 @@
             <w:pPr>
               <w:pStyle w:val="Normal"/>
               <w:widowControl/>
+              <w:suppressAutoHyphens w:val="true"/>
               <w:spacing w:lineRule="auto" w:line="240" w:before="20" w:after="20"/>
               <w:jc w:val="center"/>
               <w:rPr>
@@ -2780,6 +2876,7 @@
             <w:pPr>
               <w:pStyle w:val="Normal"/>
               <w:widowControl/>
+              <w:suppressAutoHyphens w:val="true"/>
               <w:spacing w:lineRule="auto" w:line="240" w:before="20" w:after="20"/>
               <w:jc w:val="start"/>
               <w:rPr>
@@ -2816,6 +2913,7 @@
             <w:pPr>
               <w:pStyle w:val="Normal"/>
               <w:widowControl/>
+              <w:suppressAutoHyphens w:val="true"/>
               <w:spacing w:lineRule="auto" w:line="240" w:before="20" w:after="20"/>
               <w:jc w:val="center"/>
               <w:rPr>
@@ -2847,6 +2945,7 @@
             <w:pPr>
               <w:pStyle w:val="Normal"/>
               <w:widowControl/>
+              <w:suppressAutoHyphens w:val="true"/>
               <w:spacing w:lineRule="auto" w:line="240" w:before="20" w:after="20"/>
               <w:jc w:val="start"/>
               <w:rPr>
@@ -2878,6 +2977,7 @@
             <w:pPr>
               <w:pStyle w:val="Normal"/>
               <w:widowControl/>
+              <w:suppressAutoHyphens w:val="true"/>
               <w:spacing w:lineRule="auto" w:line="240" w:before="20" w:after="20"/>
               <w:jc w:val="start"/>
               <w:rPr>
@@ -2909,6 +3009,7 @@
             <w:pPr>
               <w:pStyle w:val="Normal"/>
               <w:widowControl/>
+              <w:suppressAutoHyphens w:val="true"/>
               <w:spacing w:lineRule="auto" w:line="240" w:before="20" w:after="20"/>
               <w:jc w:val="center"/>
               <w:rPr>
@@ -2940,6 +3041,7 @@
             <w:pPr>
               <w:pStyle w:val="Normal"/>
               <w:widowControl/>
+              <w:suppressAutoHyphens w:val="true"/>
               <w:spacing w:lineRule="auto" w:line="240" w:before="20" w:after="20"/>
               <w:jc w:val="start"/>
               <w:rPr>
@@ -2976,6 +3078,7 @@
             <w:pPr>
               <w:pStyle w:val="Normal"/>
               <w:widowControl/>
+              <w:suppressAutoHyphens w:val="true"/>
               <w:spacing w:lineRule="auto" w:line="240" w:before="20" w:after="20"/>
               <w:jc w:val="center"/>
               <w:rPr>
@@ -3007,6 +3110,7 @@
             <w:pPr>
               <w:pStyle w:val="Normal"/>
               <w:widowControl/>
+              <w:suppressAutoHyphens w:val="true"/>
               <w:spacing w:lineRule="auto" w:line="240" w:before="20" w:after="20"/>
               <w:jc w:val="start"/>
               <w:rPr>
@@ -3038,6 +3142,7 @@
             <w:pPr>
               <w:pStyle w:val="Normal"/>
               <w:widowControl/>
+              <w:suppressAutoHyphens w:val="true"/>
               <w:spacing w:lineRule="auto" w:line="240" w:before="20" w:after="20"/>
               <w:jc w:val="start"/>
               <w:rPr>
@@ -3069,6 +3174,7 @@
             <w:pPr>
               <w:pStyle w:val="Normal"/>
               <w:widowControl/>
+              <w:suppressAutoHyphens w:val="true"/>
               <w:spacing w:lineRule="auto" w:line="240" w:before="20" w:after="20"/>
               <w:jc w:val="center"/>
               <w:rPr>
@@ -3100,6 +3206,7 @@
             <w:pPr>
               <w:pStyle w:val="Normal"/>
               <w:widowControl/>
+              <w:suppressAutoHyphens w:val="true"/>
               <w:spacing w:lineRule="auto" w:line="240" w:before="20" w:after="20"/>
               <w:jc w:val="start"/>
               <w:rPr>
@@ -3136,6 +3243,7 @@
             <w:pPr>
               <w:pStyle w:val="Normal"/>
               <w:widowControl/>
+              <w:suppressAutoHyphens w:val="true"/>
               <w:spacing w:lineRule="auto" w:line="240" w:before="20" w:after="20"/>
               <w:jc w:val="center"/>
               <w:rPr>
@@ -3167,6 +3275,7 @@
             <w:pPr>
               <w:pStyle w:val="Normal"/>
               <w:widowControl/>
+              <w:suppressAutoHyphens w:val="true"/>
               <w:spacing w:lineRule="auto" w:line="240" w:before="20" w:after="20"/>
               <w:jc w:val="start"/>
               <w:rPr>
@@ -3198,6 +3307,7 @@
             <w:pPr>
               <w:pStyle w:val="Normal"/>
               <w:widowControl/>
+              <w:suppressAutoHyphens w:val="true"/>
               <w:spacing w:lineRule="auto" w:line="240" w:before="20" w:after="20"/>
               <w:jc w:val="start"/>
               <w:rPr>
@@ -3229,6 +3339,7 @@
             <w:pPr>
               <w:pStyle w:val="Normal"/>
               <w:widowControl/>
+              <w:suppressAutoHyphens w:val="true"/>
               <w:spacing w:lineRule="auto" w:line="240" w:before="20" w:after="20"/>
               <w:jc w:val="center"/>
               <w:rPr>
@@ -3260,6 +3371,7 @@
             <w:pPr>
               <w:pStyle w:val="Normal"/>
               <w:widowControl/>
+              <w:suppressAutoHyphens w:val="true"/>
               <w:spacing w:lineRule="auto" w:line="240" w:before="20" w:after="20"/>
               <w:jc w:val="start"/>
               <w:rPr>
@@ -3296,6 +3408,7 @@
             <w:pPr>
               <w:pStyle w:val="Normal"/>
               <w:widowControl/>
+              <w:suppressAutoHyphens w:val="true"/>
               <w:spacing w:lineRule="auto" w:line="240" w:before="20" w:after="20"/>
               <w:jc w:val="center"/>
               <w:rPr>
@@ -3327,6 +3440,7 @@
             <w:pPr>
               <w:pStyle w:val="Normal"/>
               <w:widowControl/>
+              <w:suppressAutoHyphens w:val="true"/>
               <w:spacing w:lineRule="auto" w:line="240" w:before="20" w:after="20"/>
               <w:jc w:val="start"/>
               <w:rPr>
@@ -3358,6 +3472,7 @@
             <w:pPr>
               <w:pStyle w:val="Normal"/>
               <w:widowControl/>
+              <w:suppressAutoHyphens w:val="true"/>
               <w:spacing w:lineRule="auto" w:line="240" w:before="20" w:after="20"/>
               <w:jc w:val="start"/>
               <w:rPr>
@@ -3389,6 +3504,7 @@
             <w:pPr>
               <w:pStyle w:val="Normal"/>
               <w:widowControl/>
+              <w:suppressAutoHyphens w:val="true"/>
               <w:spacing w:lineRule="auto" w:line="240" w:before="20" w:after="20"/>
               <w:jc w:val="center"/>
               <w:rPr>
@@ -3420,6 +3536,7 @@
             <w:pPr>
               <w:pStyle w:val="Normal"/>
               <w:widowControl/>
+              <w:suppressAutoHyphens w:val="true"/>
               <w:spacing w:lineRule="auto" w:line="240" w:before="20" w:after="20"/>
               <w:jc w:val="start"/>
               <w:rPr>
@@ -3456,6 +3573,7 @@
             <w:pPr>
               <w:pStyle w:val="Normal"/>
               <w:widowControl/>
+              <w:suppressAutoHyphens w:val="true"/>
               <w:spacing w:lineRule="auto" w:line="240" w:before="20" w:after="20"/>
               <w:jc w:val="center"/>
               <w:rPr>
@@ -3487,6 +3605,7 @@
             <w:pPr>
               <w:pStyle w:val="Normal"/>
               <w:widowControl/>
+              <w:suppressAutoHyphens w:val="true"/>
               <w:spacing w:lineRule="auto" w:line="240" w:before="20" w:after="20"/>
               <w:jc w:val="start"/>
               <w:rPr>
@@ -3518,6 +3637,7 @@
             <w:pPr>
               <w:pStyle w:val="Normal"/>
               <w:widowControl/>
+              <w:suppressAutoHyphens w:val="true"/>
               <w:spacing w:lineRule="auto" w:line="240" w:before="20" w:after="20"/>
               <w:jc w:val="start"/>
               <w:rPr>
@@ -3549,6 +3669,7 @@
             <w:pPr>
               <w:pStyle w:val="Normal"/>
               <w:widowControl/>
+              <w:suppressAutoHyphens w:val="true"/>
               <w:spacing w:lineRule="auto" w:line="240" w:before="20" w:after="20"/>
               <w:jc w:val="center"/>
               <w:rPr>
@@ -3580,6 +3701,7 @@
             <w:pPr>
               <w:pStyle w:val="Normal"/>
               <w:widowControl/>
+              <w:suppressAutoHyphens w:val="true"/>
               <w:spacing w:lineRule="auto" w:line="240" w:before="20" w:after="20"/>
               <w:jc w:val="start"/>
               <w:rPr>
@@ -3616,6 +3738,7 @@
             <w:pPr>
               <w:pStyle w:val="Normal"/>
               <w:widowControl/>
+              <w:suppressAutoHyphens w:val="true"/>
               <w:spacing w:lineRule="auto" w:line="240" w:before="20" w:after="20"/>
               <w:jc w:val="center"/>
               <w:rPr>
@@ -3647,6 +3770,7 @@
             <w:pPr>
               <w:pStyle w:val="Normal"/>
               <w:widowControl/>
+              <w:suppressAutoHyphens w:val="true"/>
               <w:spacing w:lineRule="auto" w:line="240" w:before="20" w:after="20"/>
               <w:jc w:val="start"/>
               <w:rPr>
@@ -3678,6 +3802,7 @@
             <w:pPr>
               <w:pStyle w:val="Normal"/>
               <w:widowControl/>
+              <w:suppressAutoHyphens w:val="true"/>
               <w:spacing w:lineRule="auto" w:line="240" w:before="20" w:after="20"/>
               <w:jc w:val="start"/>
               <w:rPr>
@@ -3709,6 +3834,7 @@
             <w:pPr>
               <w:pStyle w:val="Normal"/>
               <w:widowControl/>
+              <w:suppressAutoHyphens w:val="true"/>
               <w:spacing w:lineRule="auto" w:line="240" w:before="20" w:after="20"/>
               <w:jc w:val="center"/>
               <w:rPr>
@@ -3740,6 +3866,7 @@
             <w:pPr>
               <w:pStyle w:val="Normal"/>
               <w:widowControl/>
+              <w:suppressAutoHyphens w:val="true"/>
               <w:spacing w:lineRule="auto" w:line="240" w:before="20" w:after="20"/>
               <w:jc w:val="start"/>
               <w:rPr>
@@ -3776,6 +3903,7 @@
             <w:pPr>
               <w:pStyle w:val="Normal"/>
               <w:widowControl/>
+              <w:suppressAutoHyphens w:val="true"/>
               <w:spacing w:lineRule="auto" w:line="240" w:before="20" w:after="20"/>
               <w:jc w:val="center"/>
               <w:rPr>
@@ -3807,6 +3935,7 @@
             <w:pPr>
               <w:pStyle w:val="Normal"/>
               <w:widowControl/>
+              <w:suppressAutoHyphens w:val="true"/>
               <w:spacing w:lineRule="auto" w:line="240" w:before="20" w:after="20"/>
               <w:jc w:val="start"/>
               <w:rPr>
@@ -3838,6 +3967,7 @@
             <w:pPr>
               <w:pStyle w:val="Normal"/>
               <w:widowControl/>
+              <w:suppressAutoHyphens w:val="true"/>
               <w:spacing w:lineRule="auto" w:line="240" w:before="20" w:after="20"/>
               <w:jc w:val="start"/>
               <w:rPr>
@@ -3869,6 +3999,7 @@
             <w:pPr>
               <w:pStyle w:val="Normal"/>
               <w:widowControl/>
+              <w:suppressAutoHyphens w:val="true"/>
               <w:spacing w:lineRule="auto" w:line="240" w:before="20" w:after="20"/>
               <w:jc w:val="center"/>
               <w:rPr>
@@ -3900,6 +4031,7 @@
             <w:pPr>
               <w:pStyle w:val="Normal"/>
               <w:widowControl/>
+              <w:suppressAutoHyphens w:val="true"/>
               <w:spacing w:lineRule="auto" w:line="240" w:before="20" w:after="20"/>
               <w:jc w:val="start"/>
               <w:rPr>
@@ -3936,6 +4068,7 @@
             <w:pPr>
               <w:pStyle w:val="Normal"/>
               <w:widowControl/>
+              <w:suppressAutoHyphens w:val="true"/>
               <w:spacing w:lineRule="auto" w:line="240" w:before="20" w:after="20"/>
               <w:jc w:val="center"/>
               <w:rPr>
@@ -3967,6 +4100,7 @@
             <w:pPr>
               <w:pStyle w:val="Normal"/>
               <w:widowControl/>
+              <w:suppressAutoHyphens w:val="true"/>
               <w:spacing w:lineRule="auto" w:line="240" w:before="20" w:after="20"/>
               <w:jc w:val="start"/>
               <w:rPr>
@@ -3998,6 +4132,7 @@
             <w:pPr>
               <w:pStyle w:val="Normal"/>
               <w:widowControl/>
+              <w:suppressAutoHyphens w:val="true"/>
               <w:spacing w:lineRule="auto" w:line="240" w:before="20" w:after="20"/>
               <w:jc w:val="start"/>
               <w:rPr>
@@ -4029,6 +4164,7 @@
             <w:pPr>
               <w:pStyle w:val="Normal"/>
               <w:widowControl/>
+              <w:suppressAutoHyphens w:val="true"/>
               <w:spacing w:lineRule="auto" w:line="240" w:before="20" w:after="20"/>
               <w:jc w:val="center"/>
               <w:rPr>
@@ -4060,6 +4196,7 @@
             <w:pPr>
               <w:pStyle w:val="Normal"/>
               <w:widowControl/>
+              <w:suppressAutoHyphens w:val="true"/>
               <w:spacing w:lineRule="auto" w:line="240" w:before="20" w:after="20"/>
               <w:jc w:val="start"/>
               <w:rPr>
@@ -4096,6 +4233,7 @@
             <w:pPr>
               <w:pStyle w:val="Normal"/>
               <w:widowControl/>
+              <w:suppressAutoHyphens w:val="true"/>
               <w:spacing w:lineRule="auto" w:line="240" w:before="20" w:after="20"/>
               <w:jc w:val="center"/>
               <w:rPr>
@@ -4127,6 +4265,7 @@
             <w:pPr>
               <w:pStyle w:val="Normal"/>
               <w:widowControl/>
+              <w:suppressAutoHyphens w:val="true"/>
               <w:spacing w:lineRule="auto" w:line="240" w:before="20" w:after="20"/>
               <w:jc w:val="start"/>
               <w:rPr>
@@ -4158,6 +4297,7 @@
             <w:pPr>
               <w:pStyle w:val="Normal"/>
               <w:widowControl/>
+              <w:suppressAutoHyphens w:val="true"/>
               <w:spacing w:lineRule="auto" w:line="240" w:before="20" w:after="20"/>
               <w:jc w:val="start"/>
               <w:rPr>
@@ -4189,6 +4329,7 @@
             <w:pPr>
               <w:pStyle w:val="Normal"/>
               <w:widowControl/>
+              <w:suppressAutoHyphens w:val="true"/>
               <w:spacing w:lineRule="auto" w:line="240" w:before="20" w:after="20"/>
               <w:jc w:val="center"/>
               <w:rPr>
@@ -4220,6 +4361,7 @@
             <w:pPr>
               <w:pStyle w:val="Normal"/>
               <w:widowControl/>
+              <w:suppressAutoHyphens w:val="true"/>
               <w:spacing w:lineRule="auto" w:line="240" w:before="20" w:after="20"/>
               <w:jc w:val="start"/>
               <w:rPr>
@@ -4257,6 +4399,7 @@
             <w:pPr>
               <w:pStyle w:val="Normal"/>
               <w:widowControl/>
+              <w:suppressAutoHyphens w:val="true"/>
               <w:spacing w:lineRule="auto" w:line="240" w:before="20" w:after="20"/>
               <w:jc w:val="center"/>
               <w:rPr>
@@ -4290,6 +4433,7 @@
             <w:pPr>
               <w:pStyle w:val="Normal"/>
               <w:widowControl/>
+              <w:suppressAutoHyphens w:val="true"/>
               <w:spacing w:lineRule="auto" w:line="240" w:before="20" w:after="20"/>
               <w:jc w:val="start"/>
               <w:rPr>
@@ -4323,6 +4467,7 @@
             <w:pPr>
               <w:pStyle w:val="Normal"/>
               <w:widowControl/>
+              <w:suppressAutoHyphens w:val="true"/>
               <w:spacing w:lineRule="auto" w:line="240" w:before="20" w:after="20"/>
               <w:jc w:val="start"/>
               <w:rPr>
@@ -4356,6 +4501,7 @@
             <w:pPr>
               <w:pStyle w:val="Normal"/>
               <w:widowControl/>
+              <w:suppressAutoHyphens w:val="true"/>
               <w:spacing w:lineRule="auto" w:line="240" w:before="20" w:after="20"/>
               <w:jc w:val="center"/>
               <w:rPr>
@@ -4389,6 +4535,7 @@
             <w:pPr>
               <w:pStyle w:val="Normal"/>
               <w:widowControl/>
+              <w:suppressAutoHyphens w:val="true"/>
               <w:spacing w:lineRule="auto" w:line="240" w:before="20" w:after="20"/>
               <w:jc w:val="start"/>
               <w:rPr>
@@ -4426,6 +4573,7 @@
             <w:pPr>
               <w:pStyle w:val="Normal"/>
               <w:widowControl/>
+              <w:suppressAutoHyphens w:val="true"/>
               <w:spacing w:lineRule="auto" w:line="240" w:before="20" w:after="20"/>
               <w:jc w:val="center"/>
               <w:rPr>
@@ -4457,6 +4605,7 @@
             <w:pPr>
               <w:pStyle w:val="Normal"/>
               <w:widowControl/>
+              <w:suppressAutoHyphens w:val="true"/>
               <w:spacing w:lineRule="auto" w:line="240" w:before="20" w:after="20"/>
               <w:jc w:val="start"/>
               <w:rPr>
@@ -4488,6 +4637,7 @@
             <w:pPr>
               <w:pStyle w:val="Normal"/>
               <w:widowControl/>
+              <w:suppressAutoHyphens w:val="true"/>
               <w:spacing w:lineRule="auto" w:line="240" w:before="20" w:after="20"/>
               <w:jc w:val="start"/>
               <w:rPr>
@@ -4519,6 +4669,7 @@
             <w:pPr>
               <w:pStyle w:val="Normal"/>
               <w:widowControl/>
+              <w:suppressAutoHyphens w:val="true"/>
               <w:spacing w:lineRule="auto" w:line="240" w:before="20" w:after="20"/>
               <w:jc w:val="center"/>
               <w:rPr>
@@ -4550,6 +4701,7 @@
             <w:pPr>
               <w:pStyle w:val="Normal"/>
               <w:widowControl/>
+              <w:suppressAutoHyphens w:val="true"/>
               <w:spacing w:lineRule="auto" w:line="240" w:before="20" w:after="20"/>
               <w:jc w:val="start"/>
               <w:rPr>
@@ -4586,6 +4738,7 @@
             <w:pPr>
               <w:pStyle w:val="Normal"/>
               <w:widowControl/>
+              <w:suppressAutoHyphens w:val="true"/>
               <w:spacing w:lineRule="auto" w:line="240" w:before="20" w:after="20"/>
               <w:jc w:val="center"/>
               <w:rPr>
@@ -4617,6 +4770,7 @@
             <w:pPr>
               <w:pStyle w:val="Normal"/>
               <w:widowControl/>
+              <w:suppressAutoHyphens w:val="true"/>
               <w:spacing w:lineRule="auto" w:line="240" w:before="20" w:after="20"/>
               <w:jc w:val="start"/>
               <w:rPr>
@@ -4648,6 +4802,7 @@
             <w:pPr>
               <w:pStyle w:val="Normal"/>
               <w:widowControl/>
+              <w:suppressAutoHyphens w:val="true"/>
               <w:spacing w:lineRule="auto" w:line="240" w:before="20" w:after="20"/>
               <w:jc w:val="start"/>
               <w:rPr>
@@ -4679,6 +4834,7 @@
             <w:pPr>
               <w:pStyle w:val="Normal"/>
               <w:widowControl/>
+              <w:suppressAutoHyphens w:val="true"/>
               <w:spacing w:lineRule="auto" w:line="240" w:before="20" w:after="20"/>
               <w:jc w:val="center"/>
               <w:rPr>
@@ -4710,6 +4866,7 @@
             <w:pPr>
               <w:pStyle w:val="Normal"/>
               <w:widowControl/>
+              <w:suppressAutoHyphens w:val="true"/>
               <w:spacing w:lineRule="auto" w:line="240" w:before="20" w:after="20"/>
               <w:jc w:val="start"/>
               <w:rPr>
@@ -4746,6 +4903,7 @@
             <w:pPr>
               <w:pStyle w:val="Normal"/>
               <w:widowControl/>
+              <w:suppressAutoHyphens w:val="true"/>
               <w:spacing w:lineRule="auto" w:line="240" w:before="20" w:after="20"/>
               <w:jc w:val="center"/>
               <w:rPr>
@@ -4777,6 +4935,7 @@
             <w:pPr>
               <w:pStyle w:val="Normal"/>
               <w:widowControl/>
+              <w:suppressAutoHyphens w:val="true"/>
               <w:spacing w:lineRule="auto" w:line="240" w:before="20" w:after="20"/>
               <w:jc w:val="start"/>
               <w:rPr>
@@ -4808,6 +4967,7 @@
             <w:pPr>
               <w:pStyle w:val="Normal"/>
               <w:widowControl/>
+              <w:suppressAutoHyphens w:val="true"/>
               <w:spacing w:lineRule="auto" w:line="240" w:before="20" w:after="20"/>
               <w:jc w:val="start"/>
               <w:rPr>
@@ -4839,6 +4999,7 @@
             <w:pPr>
               <w:pStyle w:val="Normal"/>
               <w:widowControl/>
+              <w:suppressAutoHyphens w:val="true"/>
               <w:spacing w:lineRule="auto" w:line="240" w:before="20" w:after="20"/>
               <w:jc w:val="center"/>
               <w:rPr>
@@ -4870,6 +5031,7 @@
             <w:pPr>
               <w:pStyle w:val="Normal"/>
               <w:widowControl/>
+              <w:suppressAutoHyphens w:val="true"/>
               <w:spacing w:lineRule="auto" w:line="240" w:before="20" w:after="20"/>
               <w:jc w:val="start"/>
               <w:rPr>
@@ -4906,6 +5068,7 @@
             <w:pPr>
               <w:pStyle w:val="Normal"/>
               <w:widowControl/>
+              <w:suppressAutoHyphens w:val="true"/>
               <w:spacing w:lineRule="auto" w:line="240" w:before="20" w:after="20"/>
               <w:jc w:val="center"/>
               <w:rPr>
@@ -4937,6 +5100,7 @@
             <w:pPr>
               <w:pStyle w:val="Normal"/>
               <w:widowControl/>
+              <w:suppressAutoHyphens w:val="true"/>
               <w:spacing w:lineRule="auto" w:line="240" w:before="20" w:after="20"/>
               <w:jc w:val="start"/>
               <w:rPr>
@@ -4968,6 +5132,7 @@
             <w:pPr>
               <w:pStyle w:val="Normal"/>
               <w:widowControl/>
+              <w:suppressAutoHyphens w:val="true"/>
               <w:spacing w:lineRule="auto" w:line="240" w:before="20" w:after="20"/>
               <w:jc w:val="start"/>
               <w:rPr>
@@ -4999,6 +5164,7 @@
             <w:pPr>
               <w:pStyle w:val="Normal"/>
               <w:widowControl/>
+              <w:suppressAutoHyphens w:val="true"/>
               <w:spacing w:lineRule="auto" w:line="240" w:before="20" w:after="20"/>
               <w:jc w:val="center"/>
               <w:rPr>
@@ -5030,6 +5196,7 @@
             <w:pPr>
               <w:pStyle w:val="Normal"/>
               <w:widowControl/>
+              <w:suppressAutoHyphens w:val="true"/>
               <w:spacing w:lineRule="auto" w:line="240" w:before="20" w:after="20"/>
               <w:jc w:val="start"/>
               <w:rPr>
@@ -5066,6 +5233,7 @@
             <w:pPr>
               <w:pStyle w:val="Normal"/>
               <w:widowControl/>
+              <w:suppressAutoHyphens w:val="true"/>
               <w:spacing w:lineRule="auto" w:line="240" w:before="20" w:after="20"/>
               <w:jc w:val="center"/>
               <w:rPr>
@@ -5097,6 +5265,7 @@
             <w:pPr>
               <w:pStyle w:val="Normal"/>
               <w:widowControl/>
+              <w:suppressAutoHyphens w:val="true"/>
               <w:spacing w:lineRule="auto" w:line="240" w:before="20" w:after="20"/>
               <w:jc w:val="start"/>
               <w:rPr>
@@ -5128,6 +5297,7 @@
             <w:pPr>
               <w:pStyle w:val="Normal"/>
               <w:widowControl/>
+              <w:suppressAutoHyphens w:val="true"/>
               <w:spacing w:lineRule="auto" w:line="240" w:before="20" w:after="20"/>
               <w:jc w:val="start"/>
               <w:rPr>
@@ -5159,6 +5329,7 @@
             <w:pPr>
               <w:pStyle w:val="Normal"/>
               <w:widowControl/>
+              <w:suppressAutoHyphens w:val="true"/>
               <w:spacing w:lineRule="auto" w:line="240" w:before="20" w:after="20"/>
               <w:jc w:val="center"/>
               <w:rPr>
@@ -5190,6 +5361,7 @@
             <w:pPr>
               <w:pStyle w:val="Normal"/>
               <w:widowControl/>
+              <w:suppressAutoHyphens w:val="true"/>
               <w:spacing w:lineRule="auto" w:line="240" w:before="20" w:after="20"/>
               <w:jc w:val="start"/>
               <w:rPr>
@@ -5226,6 +5398,7 @@
             <w:pPr>
               <w:pStyle w:val="Normal"/>
               <w:widowControl/>
+              <w:suppressAutoHyphens w:val="true"/>
               <w:spacing w:lineRule="auto" w:line="240" w:before="20" w:after="20"/>
               <w:jc w:val="center"/>
               <w:rPr>
@@ -5257,6 +5430,7 @@
             <w:pPr>
               <w:pStyle w:val="Normal"/>
               <w:widowControl/>
+              <w:suppressAutoHyphens w:val="true"/>
               <w:spacing w:lineRule="auto" w:line="240" w:before="20" w:after="20"/>
               <w:jc w:val="start"/>
               <w:rPr>
@@ -5288,6 +5462,7 @@
             <w:pPr>
               <w:pStyle w:val="Normal"/>
               <w:widowControl/>
+              <w:suppressAutoHyphens w:val="true"/>
               <w:spacing w:lineRule="auto" w:line="240" w:before="20" w:after="20"/>
               <w:jc w:val="start"/>
               <w:rPr>
@@ -5319,6 +5494,7 @@
             <w:pPr>
               <w:pStyle w:val="Normal"/>
               <w:widowControl/>
+              <w:suppressAutoHyphens w:val="true"/>
               <w:spacing w:lineRule="auto" w:line="240" w:before="20" w:after="20"/>
               <w:jc w:val="center"/>
               <w:rPr>
@@ -5350,6 +5526,7 @@
             <w:pPr>
               <w:pStyle w:val="Normal"/>
               <w:widowControl/>
+              <w:suppressAutoHyphens w:val="true"/>
               <w:spacing w:lineRule="auto" w:line="240" w:before="20" w:after="20"/>
               <w:jc w:val="start"/>
               <w:rPr>
@@ -5386,6 +5563,7 @@
             <w:pPr>
               <w:pStyle w:val="Normal"/>
               <w:widowControl/>
+              <w:suppressAutoHyphens w:val="true"/>
               <w:spacing w:lineRule="auto" w:line="240" w:before="20" w:after="20"/>
               <w:jc w:val="center"/>
               <w:rPr>
@@ -5417,6 +5595,7 @@
             <w:pPr>
               <w:pStyle w:val="Normal"/>
               <w:widowControl/>
+              <w:suppressAutoHyphens w:val="true"/>
               <w:spacing w:lineRule="auto" w:line="240" w:before="20" w:after="20"/>
               <w:jc w:val="start"/>
               <w:rPr>
@@ -5448,6 +5627,7 @@
             <w:pPr>
               <w:pStyle w:val="Normal"/>
               <w:widowControl/>
+              <w:suppressAutoHyphens w:val="true"/>
               <w:spacing w:lineRule="auto" w:line="240" w:before="20" w:after="20"/>
               <w:jc w:val="start"/>
               <w:rPr>
@@ -5479,6 +5659,7 @@
             <w:pPr>
               <w:pStyle w:val="Normal"/>
               <w:widowControl/>
+              <w:suppressAutoHyphens w:val="true"/>
               <w:spacing w:lineRule="auto" w:line="240" w:before="20" w:after="20"/>
               <w:jc w:val="center"/>
               <w:rPr>
@@ -5510,6 +5691,7 @@
             <w:pPr>
               <w:pStyle w:val="Normal"/>
               <w:widowControl/>
+              <w:suppressAutoHyphens w:val="true"/>
               <w:spacing w:lineRule="auto" w:line="240" w:before="20" w:after="20"/>
               <w:jc w:val="start"/>
               <w:rPr>
@@ -5546,6 +5728,7 @@
             <w:pPr>
               <w:pStyle w:val="Normal"/>
               <w:widowControl/>
+              <w:suppressAutoHyphens w:val="true"/>
               <w:spacing w:lineRule="auto" w:line="240" w:before="20" w:after="20"/>
               <w:jc w:val="center"/>
               <w:rPr>
@@ -5577,6 +5760,7 @@
             <w:pPr>
               <w:pStyle w:val="Normal"/>
               <w:widowControl/>
+              <w:suppressAutoHyphens w:val="true"/>
               <w:spacing w:lineRule="auto" w:line="240" w:before="20" w:after="20"/>
               <w:jc w:val="start"/>
               <w:rPr>
@@ -5608,6 +5792,7 @@
             <w:pPr>
               <w:pStyle w:val="Normal"/>
               <w:widowControl/>
+              <w:suppressAutoHyphens w:val="true"/>
               <w:spacing w:lineRule="auto" w:line="240" w:before="20" w:after="20"/>
               <w:jc w:val="start"/>
               <w:rPr>
@@ -5639,6 +5824,7 @@
             <w:pPr>
               <w:pStyle w:val="Normal"/>
               <w:widowControl/>
+              <w:suppressAutoHyphens w:val="true"/>
               <w:spacing w:lineRule="auto" w:line="240" w:before="20" w:after="20"/>
               <w:jc w:val="center"/>
               <w:rPr>
@@ -5670,6 +5856,7 @@
             <w:pPr>
               <w:pStyle w:val="Normal"/>
               <w:widowControl/>
+              <w:suppressAutoHyphens w:val="true"/>
               <w:spacing w:lineRule="auto" w:line="240" w:before="20" w:after="20"/>
               <w:jc w:val="start"/>
               <w:rPr>
@@ -5706,6 +5893,7 @@
             <w:pPr>
               <w:pStyle w:val="Normal"/>
               <w:widowControl/>
+              <w:suppressAutoHyphens w:val="true"/>
               <w:spacing w:lineRule="auto" w:line="240" w:before="20" w:after="20"/>
               <w:jc w:val="center"/>
               <w:rPr>
@@ -5737,6 +5925,7 @@
             <w:pPr>
               <w:pStyle w:val="Normal"/>
               <w:widowControl/>
+              <w:suppressAutoHyphens w:val="true"/>
               <w:spacing w:lineRule="auto" w:line="240" w:before="20" w:after="20"/>
               <w:jc w:val="start"/>
               <w:rPr>
@@ -5768,6 +5957,7 @@
             <w:pPr>
               <w:pStyle w:val="Normal"/>
               <w:widowControl/>
+              <w:suppressAutoHyphens w:val="true"/>
               <w:spacing w:lineRule="auto" w:line="240" w:before="20" w:after="20"/>
               <w:jc w:val="start"/>
               <w:rPr>
@@ -5799,6 +5989,7 @@
             <w:pPr>
               <w:pStyle w:val="Normal"/>
               <w:widowControl/>
+              <w:suppressAutoHyphens w:val="true"/>
               <w:spacing w:lineRule="auto" w:line="240" w:before="20" w:after="20"/>
               <w:jc w:val="center"/>
               <w:rPr>
@@ -5830,6 +6021,7 @@
             <w:pPr>
               <w:pStyle w:val="Normal"/>
               <w:widowControl/>
+              <w:suppressAutoHyphens w:val="true"/>
               <w:spacing w:lineRule="auto" w:line="240" w:before="20" w:after="20"/>
               <w:jc w:val="start"/>
               <w:rPr>
@@ -9296,6 +9488,200 @@
         </w:drawing>
       </w:r>
     </w:p>
+    <w:p>
+      <w:pPr>
+        <w:pStyle w:val="Normal"/>
+        <w:rPr/>
+      </w:pPr>
+      <w:r>
+        <w:rPr/>
+      </w:r>
+      <w:r>
+        <w:br w:type="page"/>
+      </w:r>
+    </w:p>
+    <w:p>
+      <w:pPr>
+        <w:pStyle w:val="Heading1"/>
+        <w:spacing w:before="0" w:after="0"/>
+        <w:rPr/>
+      </w:pPr>
+      <w:r>
+        <w:rPr/>
+        <w:t>Module 2: Asynchronous Processing (RabbitMQ)</w:t>
+      </w:r>
+    </w:p>
+    <w:p>
+      <w:pPr>
+        <w:pStyle w:val="Heading2"/>
+        <w:rPr/>
+      </w:pPr>
+      <w:r>
+        <w:rPr/>
+        <w:t>A. Get Auto-Created Song Metadata (200) — async end-to-end</w:t>
+      </w:r>
+    </w:p>
+    <w:p>
+      <w:pPr>
+        <w:pStyle w:val="Normal"/>
+        <w:rPr/>
+      </w:pPr>
+      <w:r>
+        <w:rPr/>
+        <w:t xml:space="preserve">Result: 200 OK   |   Tests passed: </w:t>
+      </w:r>
+      <w:r>
+        <w:rPr/>
+        <w:t>17</w:t>
+      </w:r>
+      <w:r>
+        <w:rPr/>
+        <w:t>/17</w:t>
+      </w:r>
+    </w:p>
+    <w:p>
+      <w:pPr>
+        <w:pStyle w:val="Normal"/>
+        <w:rPr/>
+      </w:pPr>
+      <w:r>
+        <w:rPr/>
+        <w:drawing>
+          <wp:anchor distT="0" distB="0" distL="0" distR="0" simplePos="0" relativeHeight="38" behindDoc="0" locked="0" layoutInCell="0" allowOverlap="1">
+            <wp:simplePos x="0" y="0"/>
+            <wp:positionH relativeFrom="column">
+              <wp:align>center</wp:align>
+            </wp:positionH>
+            <wp:positionV relativeFrom="paragraph">
+              <wp:posOffset>635</wp:posOffset>
+            </wp:positionV>
+            <wp:extent cx="9612630" cy="4695825"/>
+            <wp:effectExtent l="0" t="0" r="0" b="0"/>
+            <wp:wrapSquare wrapText="largest"/>
+            <wp:docPr id="36" name="Image3"/>
+            <wp:cNvGraphicFramePr>
+              <a:graphicFrameLocks xmlns:a="http://schemas.openxmlformats.org/drawingml/2006/main" noChangeAspect="1"/>
+            </wp:cNvGraphicFramePr>
+            <a:graphic xmlns:a="http://schemas.openxmlformats.org/drawingml/2006/main">
+              <a:graphicData uri="http://schemas.openxmlformats.org/drawingml/2006/picture">
+                <pic:pic xmlns:pic="http://schemas.openxmlformats.org/drawingml/2006/picture">
+                  <pic:nvPicPr>
+                    <pic:cNvPr id="36" name="Image3"/>
+                    <pic:cNvPicPr>
+                      <a:picLocks noChangeAspect="1" noChangeArrowheads="1"/>
+                    </pic:cNvPicPr>
+                  </pic:nvPicPr>
+                  <pic:blipFill>
+                    <a:blip r:embed="rId37"/>
+                    <a:stretch>
+                      <a:fillRect/>
+                    </a:stretch>
+                  </pic:blipFill>
+                  <pic:spPr bwMode="auto">
+                    <a:xfrm>
+                      <a:off x="0" y="0"/>
+                      <a:ext cx="9612630" cy="4695825"/>
+                    </a:xfrm>
+                    <a:prstGeom prst="rect">
+                      <a:avLst/>
+                    </a:prstGeom>
+                    <a:noFill/>
+                  </pic:spPr>
+                </pic:pic>
+              </a:graphicData>
+            </a:graphic>
+          </wp:anchor>
+        </w:drawing>
+      </w:r>
+    </w:p>
+    <w:p>
+      <w:pPr>
+        <w:pStyle w:val="Heading2"/>
+        <w:rPr/>
+      </w:pPr>
+      <w:r>
+        <w:rPr/>
+        <w:t>B. Create Song Metadata - Already Exists (409) — auto-create + idempotency</w:t>
+      </w:r>
+    </w:p>
+    <w:p>
+      <w:pPr>
+        <w:pStyle w:val="Normal"/>
+        <w:rPr/>
+      </w:pPr>
+      <w:r>
+        <w:rPr/>
+        <w:t xml:space="preserve">Result: 409 Conflict   |   Tests passed: </w:t>
+      </w:r>
+      <w:r>
+        <w:rPr/>
+        <w:t>12/</w:t>
+      </w:r>
+      <w:r>
+        <w:rPr/>
+        <w:t>12</w:t>
+      </w:r>
+    </w:p>
+    <w:p>
+      <w:pPr>
+        <w:pStyle w:val="Normal"/>
+        <w:widowControl/>
+        <w:suppressAutoHyphens w:val="true"/>
+        <w:bidi w:val="0"/>
+        <w:spacing w:lineRule="auto" w:line="276" w:before="0" w:after="200"/>
+        <w:jc w:val="start"/>
+        <w:rPr/>
+      </w:pPr>
+      <w:r>
+        <w:rPr/>
+        <w:drawing>
+          <wp:anchor distT="0" distB="0" distL="0" distR="0" simplePos="0" relativeHeight="37" behindDoc="0" locked="0" layoutInCell="0" allowOverlap="1">
+            <wp:simplePos x="0" y="0"/>
+            <wp:positionH relativeFrom="column">
+              <wp:align>center</wp:align>
+            </wp:positionH>
+            <wp:positionV relativeFrom="paragraph">
+              <wp:posOffset>635</wp:posOffset>
+            </wp:positionV>
+            <wp:extent cx="9612630" cy="4611370"/>
+            <wp:effectExtent l="0" t="0" r="0" b="0"/>
+            <wp:wrapSquare wrapText="largest"/>
+            <wp:docPr id="37" name="Image1"/>
+            <wp:cNvGraphicFramePr>
+              <a:graphicFrameLocks xmlns:a="http://schemas.openxmlformats.org/drawingml/2006/main" noChangeAspect="1"/>
+            </wp:cNvGraphicFramePr>
+            <a:graphic xmlns:a="http://schemas.openxmlformats.org/drawingml/2006/main">
+              <a:graphicData uri="http://schemas.openxmlformats.org/drawingml/2006/picture">
+                <pic:pic xmlns:pic="http://schemas.openxmlformats.org/drawingml/2006/picture">
+                  <pic:nvPicPr>
+                    <pic:cNvPr id="37" name="Image1"/>
+                    <pic:cNvPicPr>
+                      <a:picLocks noChangeAspect="1" noChangeArrowheads="1"/>
+                    </pic:cNvPicPr>
+                  </pic:nvPicPr>
+                  <pic:blipFill>
+                    <a:blip r:embed="rId38"/>
+                    <a:stretch>
+                      <a:fillRect/>
+                    </a:stretch>
+                  </pic:blipFill>
+                  <pic:spPr bwMode="auto">
+                    <a:xfrm>
+                      <a:off x="0" y="0"/>
+                      <a:ext cx="9612630" cy="4611370"/>
+                    </a:xfrm>
+                    <a:prstGeom prst="rect">
+                      <a:avLst/>
+                    </a:prstGeom>
+                    <a:noFill/>
+                  </pic:spPr>
+                </pic:pic>
+              </a:graphicData>
+            </a:graphic>
+          </wp:anchor>
+        </w:drawing>
+      </w:r>
+    </w:p>
     <w:sectPr>
       <w:type w:val="nextPage"/>
       <w:pgSz w:orient="landscape" w:w="16838" w:h="11906"/>
@@ -9338,6 +9724,7 @@
         </w:tabs>
         <w:ind w:start="1080" w:hanging="360"/>
       </w:pPr>
+      <w:rPr/>
     </w:lvl>
     <w:lvl w:ilvl="2">
       <w:start w:val="1"/>
@@ -9350,6 +9737,7 @@
         </w:tabs>
         <w:ind w:start="1440" w:hanging="360"/>
       </w:pPr>
+      <w:rPr/>
     </w:lvl>
     <w:lvl w:ilvl="3">
       <w:start w:val="1"/>
@@ -9362,6 +9750,7 @@
         </w:tabs>
         <w:ind w:start="1800" w:hanging="360"/>
       </w:pPr>
+      <w:rPr/>
     </w:lvl>
     <w:lvl w:ilvl="4">
       <w:start w:val="1"/>
@@ -9374,6 +9763,7 @@
         </w:tabs>
         <w:ind w:start="2160" w:hanging="360"/>
       </w:pPr>
+      <w:rPr/>
     </w:lvl>
     <w:lvl w:ilvl="5">
       <w:start w:val="1"/>
@@ -9386,6 +9776,7 @@
         </w:tabs>
         <w:ind w:start="2520" w:hanging="360"/>
       </w:pPr>
+      <w:rPr/>
     </w:lvl>
     <w:lvl w:ilvl="6">
       <w:start w:val="1"/>
@@ -9398,6 +9789,7 @@
         </w:tabs>
         <w:ind w:start="2880" w:hanging="360"/>
       </w:pPr>
+      <w:rPr/>
     </w:lvl>
     <w:lvl w:ilvl="7">
       <w:start w:val="1"/>
@@ -9410,6 +9802,7 @@
         </w:tabs>
         <w:ind w:start="3240" w:hanging="360"/>
       </w:pPr>
+      <w:rPr/>
     </w:lvl>
     <w:lvl w:ilvl="8">
       <w:start w:val="1"/>
@@ -9422,6 +9815,7 @@
         </w:tabs>
         <w:ind w:start="3600" w:hanging="360"/>
       </w:pPr>
+      <w:rPr/>
     </w:lvl>
   </w:abstractNum>
   <w:abstractNum w:abstractNumId="2">
@@ -9451,6 +9845,7 @@
         </w:tabs>
         <w:ind w:start="1080" w:hanging="360"/>
       </w:pPr>
+      <w:rPr/>
     </w:lvl>
     <w:lvl w:ilvl="2">
       <w:start w:val="1"/>
@@ -9463,6 +9858,7 @@
         </w:tabs>
         <w:ind w:start="1440" w:hanging="360"/>
       </w:pPr>
+      <w:rPr/>
     </w:lvl>
     <w:lvl w:ilvl="3">
       <w:start w:val="1"/>
@@ -9475,6 +9871,7 @@
         </w:tabs>
         <w:ind w:start="1800" w:hanging="360"/>
       </w:pPr>
+      <w:rPr/>
     </w:lvl>
     <w:lvl w:ilvl="4">
       <w:start w:val="1"/>
@@ -9487,6 +9884,7 @@
         </w:tabs>
         <w:ind w:start="2160" w:hanging="360"/>
       </w:pPr>
+      <w:rPr/>
     </w:lvl>
     <w:lvl w:ilvl="5">
       <w:start w:val="1"/>
@@ -9499,6 +9897,7 @@
         </w:tabs>
         <w:ind w:start="2520" w:hanging="360"/>
       </w:pPr>
+      <w:rPr/>
     </w:lvl>
     <w:lvl w:ilvl="6">
       <w:start w:val="1"/>
@@ -9511,6 +9910,7 @@
         </w:tabs>
         <w:ind w:start="2880" w:hanging="360"/>
       </w:pPr>
+      <w:rPr/>
     </w:lvl>
     <w:lvl w:ilvl="7">
       <w:start w:val="1"/>
@@ -9523,6 +9923,7 @@
         </w:tabs>
         <w:ind w:start="3240" w:hanging="360"/>
       </w:pPr>
+      <w:rPr/>
     </w:lvl>
     <w:lvl w:ilvl="8">
       <w:start w:val="1"/>
@@ -9535,6 +9936,7 @@
         </w:tabs>
         <w:ind w:start="3600" w:hanging="360"/>
       </w:pPr>
+      <w:rPr/>
     </w:lvl>
   </w:abstractNum>
   <w:abstractNum w:abstractNumId="3">
@@ -9564,6 +9966,7 @@
         </w:tabs>
         <w:ind w:start="1080" w:hanging="360"/>
       </w:pPr>
+      <w:rPr/>
     </w:lvl>
     <w:lvl w:ilvl="2">
       <w:start w:val="1"/>
@@ -9576,6 +9979,7 @@
         </w:tabs>
         <w:ind w:start="1440" w:hanging="360"/>
       </w:pPr>
+      <w:rPr/>
     </w:lvl>
     <w:lvl w:ilvl="3">
       <w:start w:val="1"/>
@@ -9588,6 +9992,7 @@
         </w:tabs>
         <w:ind w:start="1800" w:hanging="360"/>
       </w:pPr>
+      <w:rPr/>
     </w:lvl>
     <w:lvl w:ilvl="4">
       <w:start w:val="1"/>
@@ -9600,6 +10005,7 @@
         </w:tabs>
         <w:ind w:start="2160" w:hanging="360"/>
       </w:pPr>
+      <w:rPr/>
     </w:lvl>
     <w:lvl w:ilvl="5">
       <w:start w:val="1"/>
@@ -9612,6 +10018,7 @@
         </w:tabs>
         <w:ind w:start="2520" w:hanging="360"/>
       </w:pPr>
+      <w:rPr/>
     </w:lvl>
     <w:lvl w:ilvl="6">
       <w:start w:val="1"/>
@@ -9624,6 +10031,7 @@
         </w:tabs>
         <w:ind w:start="2880" w:hanging="360"/>
       </w:pPr>
+      <w:rPr/>
     </w:lvl>
     <w:lvl w:ilvl="7">
       <w:start w:val="1"/>
@@ -9636,6 +10044,7 @@
         </w:tabs>
         <w:ind w:start="3240" w:hanging="360"/>
       </w:pPr>
+      <w:rPr/>
     </w:lvl>
     <w:lvl w:ilvl="8">
       <w:start w:val="1"/>
@@ -9648,6 +10057,7 @@
         </w:tabs>
         <w:ind w:start="3600" w:hanging="360"/>
       </w:pPr>
+      <w:rPr/>
     </w:lvl>
   </w:abstractNum>
   <w:abstractNum w:abstractNumId="4">
@@ -9675,6 +10085,7 @@
         </w:tabs>
         <w:ind w:start="1080" w:hanging="360"/>
       </w:pPr>
+      <w:rPr/>
     </w:lvl>
     <w:lvl w:ilvl="2">
       <w:start w:val="1"/>
@@ -9687,6 +10098,7 @@
         </w:tabs>
         <w:ind w:start="1440" w:hanging="360"/>
       </w:pPr>
+      <w:rPr/>
     </w:lvl>
     <w:lvl w:ilvl="3">
       <w:start w:val="1"/>
@@ -9699,6 +10111,7 @@
         </w:tabs>
         <w:ind w:start="1800" w:hanging="360"/>
       </w:pPr>
+      <w:rPr/>
     </w:lvl>
     <w:lvl w:ilvl="4">
       <w:start w:val="1"/>
@@ -9711,6 +10124,7 @@
         </w:tabs>
         <w:ind w:start="2160" w:hanging="360"/>
       </w:pPr>
+      <w:rPr/>
     </w:lvl>
     <w:lvl w:ilvl="5">
       <w:start w:val="1"/>
@@ -9723,6 +10137,7 @@
         </w:tabs>
         <w:ind w:start="2520" w:hanging="360"/>
       </w:pPr>
+      <w:rPr/>
     </w:lvl>
     <w:lvl w:ilvl="6">
       <w:start w:val="1"/>
@@ -9735,6 +10150,7 @@
         </w:tabs>
         <w:ind w:start="2880" w:hanging="360"/>
       </w:pPr>
+      <w:rPr/>
     </w:lvl>
     <w:lvl w:ilvl="7">
       <w:start w:val="1"/>
@@ -9747,6 +10163,7 @@
         </w:tabs>
         <w:ind w:start="3240" w:hanging="360"/>
       </w:pPr>
+      <w:rPr/>
     </w:lvl>
     <w:lvl w:ilvl="8">
       <w:start w:val="1"/>
@@ -9759,6 +10176,7 @@
         </w:tabs>
         <w:ind w:start="3600" w:hanging="360"/>
       </w:pPr>
+      <w:rPr/>
     </w:lvl>
   </w:abstractNum>
   <w:abstractNum w:abstractNumId="5">
@@ -9786,6 +10204,7 @@
         </w:tabs>
         <w:ind w:start="1080" w:hanging="360"/>
       </w:pPr>
+      <w:rPr/>
     </w:lvl>
     <w:lvl w:ilvl="2">
       <w:start w:val="1"/>
@@ -9798,6 +10217,7 @@
         </w:tabs>
         <w:ind w:start="1440" w:hanging="360"/>
       </w:pPr>
+      <w:rPr/>
     </w:lvl>
     <w:lvl w:ilvl="3">
       <w:start w:val="1"/>
@@ -9810,6 +10230,7 @@
         </w:tabs>
         <w:ind w:start="1800" w:hanging="360"/>
       </w:pPr>
+      <w:rPr/>
     </w:lvl>
     <w:lvl w:ilvl="4">
       <w:start w:val="1"/>
@@ -9822,6 +10243,7 @@
         </w:tabs>
         <w:ind w:start="2160" w:hanging="360"/>
       </w:pPr>
+      <w:rPr/>
     </w:lvl>
     <w:lvl w:ilvl="5">
       <w:start w:val="1"/>
@@ -9834,6 +10256,7 @@
         </w:tabs>
         <w:ind w:start="2520" w:hanging="360"/>
       </w:pPr>
+      <w:rPr/>
     </w:lvl>
     <w:lvl w:ilvl="6">
       <w:start w:val="1"/>
@@ -9846,6 +10269,7 @@
         </w:tabs>
         <w:ind w:start="2880" w:hanging="360"/>
       </w:pPr>
+      <w:rPr/>
     </w:lvl>
     <w:lvl w:ilvl="7">
       <w:start w:val="1"/>
@@ -9858,6 +10282,7 @@
         </w:tabs>
         <w:ind w:start="3240" w:hanging="360"/>
       </w:pPr>
+      <w:rPr/>
     </w:lvl>
     <w:lvl w:ilvl="8">
       <w:start w:val="1"/>
@@ -9870,6 +10295,7 @@
         </w:tabs>
         <w:ind w:start="3600" w:hanging="360"/>
       </w:pPr>
+      <w:rPr/>
     </w:lvl>
   </w:abstractNum>
   <w:abstractNum w:abstractNumId="6">
@@ -9897,6 +10323,7 @@
         </w:tabs>
         <w:ind w:start="1080" w:hanging="360"/>
       </w:pPr>
+      <w:rPr/>
     </w:lvl>
     <w:lvl w:ilvl="2">
       <w:start w:val="1"/>
@@ -9909,6 +10336,7 @@
         </w:tabs>
         <w:ind w:start="1440" w:hanging="360"/>
       </w:pPr>
+      <w:rPr/>
     </w:lvl>
     <w:lvl w:ilvl="3">
       <w:start w:val="1"/>
@@ -9921,6 +10349,7 @@
         </w:tabs>
         <w:ind w:start="1800" w:hanging="360"/>
       </w:pPr>
+      <w:rPr/>
     </w:lvl>
     <w:lvl w:ilvl="4">
       <w:start w:val="1"/>
@@ -9933,6 +10362,7 @@
         </w:tabs>
         <w:ind w:start="2160" w:hanging="360"/>
       </w:pPr>
+      <w:rPr/>
     </w:lvl>
     <w:lvl w:ilvl="5">
       <w:start w:val="1"/>
@@ -9945,6 +10375,7 @@
         </w:tabs>
         <w:ind w:start="2520" w:hanging="360"/>
       </w:pPr>
+      <w:rPr/>
     </w:lvl>
     <w:lvl w:ilvl="6">
       <w:start w:val="1"/>
@@ -9957,6 +10388,7 @@
         </w:tabs>
         <w:ind w:start="2880" w:hanging="360"/>
       </w:pPr>
+      <w:rPr/>
     </w:lvl>
     <w:lvl w:ilvl="7">
       <w:start w:val="1"/>
@@ -9969,6 +10401,7 @@
         </w:tabs>
         <w:ind w:start="3240" w:hanging="360"/>
       </w:pPr>
+      <w:rPr/>
     </w:lvl>
     <w:lvl w:ilvl="8">
       <w:start w:val="1"/>
@@ -9981,6 +10414,7 @@
         </w:tabs>
         <w:ind w:start="3600" w:hanging="360"/>
       </w:pPr>
+      <w:rPr/>
     </w:lvl>
   </w:abstractNum>
   <w:abstractNum w:abstractNumId="7">
@@ -10131,7 +10565,7 @@
   <w:docDefaults>
     <w:rPrDefault>
       <w:rPr>
-        <w:rFonts w:ascii="Cambria" w:hAnsi="Cambria" w:eastAsia="ＭＳ 明朝" w:cs="" w:asciiTheme="minorHAnsi" w:cstheme="minorBidi" w:eastAsiaTheme="minorEastAsia" w:hAnsiTheme="minorHAnsi"/>
+        <w:rFonts w:ascii="Cambria" w:hAnsi="Cambria" w:eastAsia="" w:cs="" w:asciiTheme="minorHAnsi" w:cstheme="minorBidi" w:eastAsiaTheme="minorEastAsia" w:hAnsiTheme="minorHAnsi"/>
         <w:sz w:val="22"/>
         <w:szCs w:val="22"/>
         <w:lang w:val="en-US" w:eastAsia="en-US" w:bidi="ar-SA"/>
@@ -10288,12 +10722,13 @@
     <w:rsid w:val="00fc693f"/>
     <w:pPr>
       <w:widowControl/>
+      <w:suppressAutoHyphens w:val="true"/>
       <w:bidi w:val="0"/>
       <w:spacing w:lineRule="auto" w:line="276" w:before="0" w:after="200"/>
       <w:jc w:val="start"/>
     </w:pPr>
     <w:rPr>
-      <w:rFonts w:ascii="Calibri" w:hAnsi="Calibri" w:eastAsia="ＭＳ 明朝" w:cs="" w:cstheme="minorBidi" w:eastAsiaTheme="minorEastAsia"/>
+      <w:rFonts w:ascii="Calibri" w:hAnsi="Calibri" w:eastAsia="" w:cs="" w:cstheme="minorBidi" w:eastAsiaTheme="minorEastAsia"/>
       <w:color w:val="auto"/>
       <w:kern w:val="0"/>
       <w:sz w:val="22"/>
@@ -10316,7 +10751,7 @@
       <w:outlineLvl w:val="0"/>
     </w:pPr>
     <w:rPr>
-      <w:rFonts w:ascii="Calibri" w:hAnsi="Calibri" w:eastAsia="ＭＳ ゴシック" w:cs="" w:asciiTheme="majorHAnsi" w:cstheme="majorBidi" w:eastAsiaTheme="majorEastAsia" w:hAnsiTheme="majorHAnsi"/>
+      <w:rFonts w:ascii="Calibri" w:hAnsi="Calibri" w:eastAsia="" w:cs="" w:asciiTheme="majorHAnsi" w:cstheme="majorBidi" w:eastAsiaTheme="majorEastAsia" w:hAnsiTheme="majorHAnsi"/>
       <w:b/>
       <w:bCs/>
       <w:color w:themeColor="accent1" w:themeShade="bf" w:val="365F91"/>
@@ -10340,7 +10775,7 @@
       <w:outlineLvl w:val="1"/>
     </w:pPr>
     <w:rPr>
-      <w:rFonts w:ascii="Calibri" w:hAnsi="Calibri" w:eastAsia="ＭＳ ゴシック" w:cs="" w:asciiTheme="majorHAnsi" w:cstheme="majorBidi" w:eastAsiaTheme="majorEastAsia" w:hAnsiTheme="majorHAnsi"/>
+      <w:rFonts w:ascii="Calibri" w:hAnsi="Calibri" w:eastAsia="" w:cs="" w:asciiTheme="majorHAnsi" w:cstheme="majorBidi" w:eastAsiaTheme="majorEastAsia" w:hAnsiTheme="majorHAnsi"/>
       <w:b/>
       <w:bCs/>
       <w:color w:themeColor="accent1" w:val="4F81BD"/>
@@ -10364,7 +10799,7 @@
       <w:outlineLvl w:val="2"/>
     </w:pPr>
     <w:rPr>
-      <w:rFonts w:ascii="Calibri" w:hAnsi="Calibri" w:eastAsia="ＭＳ ゴシック" w:cs="" w:asciiTheme="majorHAnsi" w:cstheme="majorBidi" w:eastAsiaTheme="majorEastAsia" w:hAnsiTheme="majorHAnsi"/>
+      <w:rFonts w:ascii="Calibri" w:hAnsi="Calibri" w:eastAsia="" w:cs="" w:asciiTheme="majorHAnsi" w:cstheme="majorBidi" w:eastAsiaTheme="majorEastAsia" w:hAnsiTheme="majorHAnsi"/>
       <w:b/>
       <w:bCs/>
       <w:color w:themeColor="accent1" w:val="4F81BD"/>
@@ -10387,7 +10822,7 @@
       <w:outlineLvl w:val="3"/>
     </w:pPr>
     <w:rPr>
-      <w:rFonts w:ascii="Calibri" w:hAnsi="Calibri" w:eastAsia="ＭＳ ゴシック" w:cs="" w:asciiTheme="majorHAnsi" w:cstheme="majorBidi" w:eastAsiaTheme="majorEastAsia" w:hAnsiTheme="majorHAnsi"/>
+      <w:rFonts w:ascii="Calibri" w:hAnsi="Calibri" w:eastAsia="" w:cs="" w:asciiTheme="majorHAnsi" w:cstheme="majorBidi" w:eastAsiaTheme="majorEastAsia" w:hAnsiTheme="majorHAnsi"/>
       <w:b/>
       <w:bCs/>
       <w:i/>
@@ -10412,7 +10847,7 @@
       <w:outlineLvl w:val="4"/>
     </w:pPr>
     <w:rPr>
-      <w:rFonts w:ascii="Calibri" w:hAnsi="Calibri" w:eastAsia="ＭＳ ゴシック" w:cs="" w:asciiTheme="majorHAnsi" w:cstheme="majorBidi" w:eastAsiaTheme="majorEastAsia" w:hAnsiTheme="majorHAnsi"/>
+      <w:rFonts w:ascii="Calibri" w:hAnsi="Calibri" w:eastAsia="" w:cs="" w:asciiTheme="majorHAnsi" w:cstheme="majorBidi" w:eastAsiaTheme="majorEastAsia" w:hAnsiTheme="majorHAnsi"/>
       <w:color w:themeColor="accent1" w:themeShade="7f" w:val="243F60"/>
     </w:rPr>
   </w:style>
@@ -10433,7 +10868,7 @@
       <w:outlineLvl w:val="5"/>
     </w:pPr>
     <w:rPr>
-      <w:rFonts w:ascii="Calibri" w:hAnsi="Calibri" w:eastAsia="ＭＳ ゴシック" w:cs="" w:asciiTheme="majorHAnsi" w:cstheme="majorBidi" w:eastAsiaTheme="majorEastAsia" w:hAnsiTheme="majorHAnsi"/>
+      <w:rFonts w:ascii="Calibri" w:hAnsi="Calibri" w:eastAsia="" w:cs="" w:asciiTheme="majorHAnsi" w:cstheme="majorBidi" w:eastAsiaTheme="majorEastAsia" w:hAnsiTheme="majorHAnsi"/>
       <w:i/>
       <w:iCs/>
       <w:color w:themeColor="accent1" w:themeShade="7f" w:val="243F60"/>
@@ -10456,7 +10891,7 @@
       <w:outlineLvl w:val="6"/>
     </w:pPr>
     <w:rPr>
-      <w:rFonts w:ascii="Calibri" w:hAnsi="Calibri" w:eastAsia="ＭＳ ゴシック" w:cs="" w:asciiTheme="majorHAnsi" w:cstheme="majorBidi" w:eastAsiaTheme="majorEastAsia" w:hAnsiTheme="majorHAnsi"/>
+      <w:rFonts w:ascii="Calibri" w:hAnsi="Calibri" w:eastAsia="" w:cs="" w:asciiTheme="majorHAnsi" w:cstheme="majorBidi" w:eastAsiaTheme="majorEastAsia" w:hAnsiTheme="majorHAnsi"/>
       <w:i/>
       <w:iCs/>
       <w:color w:themeColor="text1" w:themeTint="bf" w:val="404040"/>
@@ -10479,7 +10914,7 @@
       <w:outlineLvl w:val="7"/>
     </w:pPr>
     <w:rPr>
-      <w:rFonts w:ascii="Calibri" w:hAnsi="Calibri" w:eastAsia="ＭＳ ゴシック" w:cs="" w:asciiTheme="majorHAnsi" w:cstheme="majorBidi" w:eastAsiaTheme="majorEastAsia" w:hAnsiTheme="majorHAnsi"/>
+      <w:rFonts w:ascii="Calibri" w:hAnsi="Calibri" w:eastAsia="" w:cs="" w:asciiTheme="majorHAnsi" w:cstheme="majorBidi" w:eastAsiaTheme="majorEastAsia" w:hAnsiTheme="majorHAnsi"/>
       <w:color w:themeColor="accent1" w:val="4F81BD"/>
       <w:sz w:val="20"/>
       <w:szCs w:val="20"/>
@@ -10502,7 +10937,7 @@
       <w:outlineLvl w:val="8"/>
     </w:pPr>
     <w:rPr>
-      <w:rFonts w:ascii="Calibri" w:hAnsi="Calibri" w:eastAsia="ＭＳ ゴシック" w:cs="" w:asciiTheme="majorHAnsi" w:cstheme="majorBidi" w:eastAsiaTheme="majorEastAsia" w:hAnsiTheme="majorHAnsi"/>
+      <w:rFonts w:ascii="Calibri" w:hAnsi="Calibri" w:eastAsia="" w:cs="" w:asciiTheme="majorHAnsi" w:cstheme="majorBidi" w:eastAsiaTheme="majorEastAsia" w:hAnsiTheme="majorHAnsi"/>
       <w:i/>
       <w:iCs/>
       <w:color w:themeColor="text1" w:themeTint="bf" w:val="404040"/>
@@ -10544,7 +10979,7 @@
     <w:qFormat/>
     <w:rsid w:val="00fc693f"/>
     <w:rPr>
-      <w:rFonts w:ascii="Calibri" w:hAnsi="Calibri" w:eastAsia="ＭＳ ゴシック" w:cs="" w:asciiTheme="majorHAnsi" w:cstheme="majorBidi" w:eastAsiaTheme="majorEastAsia" w:hAnsiTheme="majorHAnsi"/>
+      <w:rFonts w:ascii="Calibri" w:hAnsi="Calibri" w:eastAsia="" w:cs="" w:asciiTheme="majorHAnsi" w:cstheme="majorBidi" w:eastAsiaTheme="majorEastAsia" w:hAnsiTheme="majorHAnsi"/>
       <w:b/>
       <w:bCs/>
       <w:color w:themeColor="accent1" w:themeShade="bf" w:val="365F91"/>
@@ -10560,7 +10995,7 @@
     <w:qFormat/>
     <w:rsid w:val="00fc693f"/>
     <w:rPr>
-      <w:rFonts w:ascii="Calibri" w:hAnsi="Calibri" w:eastAsia="ＭＳ ゴシック" w:cs="" w:asciiTheme="majorHAnsi" w:cstheme="majorBidi" w:eastAsiaTheme="majorEastAsia" w:hAnsiTheme="majorHAnsi"/>
+      <w:rFonts w:ascii="Calibri" w:hAnsi="Calibri" w:eastAsia="" w:cs="" w:asciiTheme="majorHAnsi" w:cstheme="majorBidi" w:eastAsiaTheme="majorEastAsia" w:hAnsiTheme="majorHAnsi"/>
       <w:b/>
       <w:bCs/>
       <w:color w:themeColor="accent1" w:val="4F81BD"/>
@@ -10576,7 +11011,7 @@
     <w:qFormat/>
     <w:rsid w:val="00fc693f"/>
     <w:rPr>
-      <w:rFonts w:ascii="Calibri" w:hAnsi="Calibri" w:eastAsia="ＭＳ ゴシック" w:cs="" w:asciiTheme="majorHAnsi" w:cstheme="majorBidi" w:eastAsiaTheme="majorEastAsia" w:hAnsiTheme="majorHAnsi"/>
+      <w:rFonts w:ascii="Calibri" w:hAnsi="Calibri" w:eastAsia="" w:cs="" w:asciiTheme="majorHAnsi" w:cstheme="majorBidi" w:eastAsiaTheme="majorEastAsia" w:hAnsiTheme="majorHAnsi"/>
       <w:b/>
       <w:bCs/>
       <w:color w:themeColor="accent1" w:val="4F81BD"/>
@@ -10590,7 +11025,7 @@
     <w:qFormat/>
     <w:rsid w:val="00fc693f"/>
     <w:rPr>
-      <w:rFonts w:ascii="Calibri" w:hAnsi="Calibri" w:eastAsia="ＭＳ ゴシック" w:cs="" w:asciiTheme="majorHAnsi" w:cstheme="majorBidi" w:eastAsiaTheme="majorEastAsia" w:hAnsiTheme="majorHAnsi"/>
+      <w:rFonts w:ascii="Calibri" w:hAnsi="Calibri" w:eastAsia="" w:cs="" w:asciiTheme="majorHAnsi" w:cstheme="majorBidi" w:eastAsiaTheme="majorEastAsia" w:hAnsiTheme="majorHAnsi"/>
       <w:color w:themeColor="text2" w:themeShade="bf" w:val="17365D"/>
       <w:spacing w:val="5"/>
       <w:kern w:val="2"/>
@@ -10606,7 +11041,7 @@
     <w:qFormat/>
     <w:rsid w:val="00fc693f"/>
     <w:rPr>
-      <w:rFonts w:ascii="Calibri" w:hAnsi="Calibri" w:eastAsia="ＭＳ ゴシック" w:cs="" w:asciiTheme="majorHAnsi" w:cstheme="majorBidi" w:eastAsiaTheme="majorEastAsia" w:hAnsiTheme="majorHAnsi"/>
+      <w:rFonts w:ascii="Calibri" w:hAnsi="Calibri" w:eastAsia="" w:cs="" w:asciiTheme="majorHAnsi" w:cstheme="majorBidi" w:eastAsiaTheme="majorEastAsia" w:hAnsiTheme="majorHAnsi"/>
       <w:i/>
       <w:iCs/>
       <w:color w:themeColor="accent1" w:val="4F81BD"/>
@@ -10679,7 +11114,7 @@
     <w:qFormat/>
     <w:rsid w:val="00fc693f"/>
     <w:rPr>
-      <w:rFonts w:ascii="Calibri" w:hAnsi="Calibri" w:eastAsia="ＭＳ ゴシック" w:cs="" w:asciiTheme="majorHAnsi" w:cstheme="majorBidi" w:eastAsiaTheme="majorEastAsia" w:hAnsiTheme="majorHAnsi"/>
+      <w:rFonts w:ascii="Calibri" w:hAnsi="Calibri" w:eastAsia="" w:cs="" w:asciiTheme="majorHAnsi" w:cstheme="majorBidi" w:eastAsiaTheme="majorEastAsia" w:hAnsiTheme="majorHAnsi"/>
       <w:b/>
       <w:bCs/>
       <w:i/>
@@ -10696,7 +11131,7 @@
     <w:qFormat/>
     <w:rsid w:val="00fc693f"/>
     <w:rPr>
-      <w:rFonts w:ascii="Calibri" w:hAnsi="Calibri" w:eastAsia="ＭＳ ゴシック" w:cs="" w:asciiTheme="majorHAnsi" w:cstheme="majorBidi" w:eastAsiaTheme="majorEastAsia" w:hAnsiTheme="majorHAnsi"/>
+      <w:rFonts w:ascii="Calibri" w:hAnsi="Calibri" w:eastAsia="" w:cs="" w:asciiTheme="majorHAnsi" w:cstheme="majorBidi" w:eastAsiaTheme="majorEastAsia" w:hAnsiTheme="majorHAnsi"/>
       <w:color w:themeColor="accent1" w:themeShade="7f" w:val="243F60"/>
     </w:rPr>
   </w:style>
@@ -10709,7 +11144,7 @@
     <w:qFormat/>
     <w:rsid w:val="00fc693f"/>
     <w:rPr>
-      <w:rFonts w:ascii="Calibri" w:hAnsi="Calibri" w:eastAsia="ＭＳ ゴシック" w:cs="" w:asciiTheme="majorHAnsi" w:cstheme="majorBidi" w:eastAsiaTheme="majorEastAsia" w:hAnsiTheme="majorHAnsi"/>
+      <w:rFonts w:ascii="Calibri" w:hAnsi="Calibri" w:eastAsia="" w:cs="" w:asciiTheme="majorHAnsi" w:cstheme="majorBidi" w:eastAsiaTheme="majorEastAsia" w:hAnsiTheme="majorHAnsi"/>
       <w:i/>
       <w:iCs/>
       <w:color w:themeColor="accent1" w:themeShade="7f" w:val="243F60"/>
@@ -10724,7 +11159,7 @@
     <w:qFormat/>
     <w:rsid w:val="00fc693f"/>
     <w:rPr>
-      <w:rFonts w:ascii="Calibri" w:hAnsi="Calibri" w:eastAsia="ＭＳ ゴシック" w:cs="" w:asciiTheme="majorHAnsi" w:cstheme="majorBidi" w:eastAsiaTheme="majorEastAsia" w:hAnsiTheme="majorHAnsi"/>
+      <w:rFonts w:ascii="Calibri" w:hAnsi="Calibri" w:eastAsia="" w:cs="" w:asciiTheme="majorHAnsi" w:cstheme="majorBidi" w:eastAsiaTheme="majorEastAsia" w:hAnsiTheme="majorHAnsi"/>
       <w:i/>
       <w:iCs/>
       <w:color w:themeColor="text1" w:themeTint="bf" w:val="404040"/>
@@ -10739,7 +11174,7 @@
     <w:qFormat/>
     <w:rsid w:val="00fc693f"/>
     <w:rPr>
-      <w:rFonts w:ascii="Calibri" w:hAnsi="Calibri" w:eastAsia="ＭＳ ゴシック" w:cs="" w:asciiTheme="majorHAnsi" w:cstheme="majorBidi" w:eastAsiaTheme="majorEastAsia" w:hAnsiTheme="majorHAnsi"/>
+      <w:rFonts w:ascii="Calibri" w:hAnsi="Calibri" w:eastAsia="" w:cs="" w:asciiTheme="majorHAnsi" w:cstheme="majorBidi" w:eastAsiaTheme="majorEastAsia" w:hAnsiTheme="majorHAnsi"/>
       <w:color w:themeColor="accent1" w:val="4F81BD"/>
       <w:sz w:val="20"/>
       <w:szCs w:val="20"/>
@@ -10754,7 +11189,7 @@
     <w:qFormat/>
     <w:rsid w:val="00fc693f"/>
     <w:rPr>
-      <w:rFonts w:ascii="Calibri" w:hAnsi="Calibri" w:eastAsia="ＭＳ ゴシック" w:cs="" w:asciiTheme="majorHAnsi" w:cstheme="majorBidi" w:eastAsiaTheme="majorEastAsia" w:hAnsiTheme="majorHAnsi"/>
+      <w:rFonts w:ascii="Calibri" w:hAnsi="Calibri" w:eastAsia="" w:cs="" w:asciiTheme="majorHAnsi" w:cstheme="majorBidi" w:eastAsiaTheme="majorEastAsia" w:hAnsiTheme="majorHAnsi"/>
       <w:i/>
       <w:iCs/>
       <w:color w:themeColor="text1" w:themeTint="bf" w:val="404040"/>
@@ -10984,12 +11419,13 @@
     <w:rsid w:val="00fc693f"/>
     <w:pPr>
       <w:widowControl/>
+      <w:suppressAutoHyphens w:val="true"/>
       <w:bidi w:val="0"/>
       <w:spacing w:lineRule="auto" w:line="240" w:before="0" w:after="0"/>
       <w:jc w:val="start"/>
     </w:pPr>
     <w:rPr>
-      <w:rFonts w:ascii="Cambria" w:hAnsi="Cambria" w:eastAsia="ＭＳ 明朝" w:cs="" w:asciiTheme="minorHAnsi" w:cstheme="minorBidi" w:eastAsiaTheme="minorEastAsia" w:hAnsiTheme="minorHAnsi"/>
+      <w:rFonts w:ascii="Cambria" w:hAnsi="Cambria" w:eastAsia="" w:cs="" w:asciiTheme="minorHAnsi" w:cstheme="minorBidi" w:eastAsiaTheme="minorEastAsia" w:hAnsiTheme="minorHAnsi"/>
       <w:color w:val="auto"/>
       <w:kern w:val="0"/>
       <w:sz w:val="22"/>
@@ -11013,7 +11449,7 @@
       <w:contextualSpacing/>
     </w:pPr>
     <w:rPr>
-      <w:rFonts w:ascii="Calibri" w:hAnsi="Calibri" w:eastAsia="ＭＳ ゴシック" w:cs="" w:asciiTheme="majorHAnsi" w:cstheme="majorBidi" w:eastAsiaTheme="majorEastAsia" w:hAnsiTheme="majorHAnsi"/>
+      <w:rFonts w:ascii="Calibri" w:hAnsi="Calibri" w:eastAsia="" w:cs="" w:asciiTheme="majorHAnsi" w:cstheme="majorBidi" w:eastAsiaTheme="majorEastAsia" w:hAnsiTheme="majorHAnsi"/>
       <w:color w:themeColor="text2" w:themeShade="bf" w:val="17365D"/>
       <w:spacing w:val="5"/>
       <w:kern w:val="2"/>
@@ -11031,7 +11467,7 @@
     <w:rsid w:val="00fc693f"/>
     <w:pPr/>
     <w:rPr>
-      <w:rFonts w:ascii="Calibri" w:hAnsi="Calibri" w:eastAsia="ＭＳ ゴシック" w:cs="" w:asciiTheme="majorHAnsi" w:cstheme="majorBidi" w:eastAsiaTheme="majorEastAsia" w:hAnsiTheme="majorHAnsi"/>
+      <w:rFonts w:ascii="Calibri" w:hAnsi="Calibri" w:eastAsia="" w:cs="" w:asciiTheme="majorHAnsi" w:cstheme="majorBidi" w:eastAsiaTheme="majorEastAsia" w:hAnsiTheme="majorHAnsi"/>
       <w:i/>
       <w:iCs/>
       <w:color w:themeColor="accent1" w:val="4F81BD"/>
@@ -11264,12 +11700,13 @@
         <w:tab w:val="left" w:pos="3456" w:leader="none"/>
         <w:tab w:val="left" w:pos="4032" w:leader="none"/>
       </w:tabs>
+      <w:suppressAutoHyphens w:val="true"/>
       <w:bidi w:val="0"/>
       <w:spacing w:lineRule="auto" w:line="276" w:before="0" w:after="200"/>
       <w:jc w:val="start"/>
     </w:pPr>
     <w:rPr>
-      <w:rFonts w:ascii="Courier" w:hAnsi="Courier" w:eastAsia="ＭＳ 明朝" w:cs="" w:cstheme="minorBidi" w:eastAsiaTheme="minorEastAsia"/>
+      <w:rFonts w:ascii="Courier" w:hAnsi="Courier" w:eastAsia="" w:cs="" w:cstheme="minorBidi" w:eastAsiaTheme="minorEastAsia"/>
       <w:color w:val="auto"/>
       <w:kern w:val="0"/>
       <w:sz w:val="20"/>
@@ -14467,7 +14904,6 @@
       <w:pPr>
         <w:spacing w:before="0" w:after="0" w:line="240" w:lineRule="auto"/>
       </w:pPr>
-      <w:rPr/>
       <w:tblPr/>
       <w:tcPr>
         <w:tcBorders>
@@ -14613,7 +15049,6 @@
       <w:pPr>
         <w:spacing w:before="0" w:after="0" w:line="240" w:lineRule="auto"/>
       </w:pPr>
-      <w:rPr/>
       <w:tblPr/>
       <w:tcPr>
         <w:tcBorders>
@@ -14759,7 +15194,6 @@
       <w:pPr>
         <w:spacing w:before="0" w:after="0" w:line="240" w:lineRule="auto"/>
       </w:pPr>
-      <w:rPr/>
       <w:tblPr/>
       <w:tcPr>
         <w:tcBorders>
@@ -14905,7 +15339,6 @@
       <w:pPr>
         <w:spacing w:before="0" w:after="0" w:line="240" w:lineRule="auto"/>
       </w:pPr>
-      <w:rPr/>
       <w:tblPr/>
       <w:tcPr>
         <w:tcBorders>
@@ -15051,7 +15484,6 @@
       <w:pPr>
         <w:spacing w:before="0" w:after="0" w:line="240" w:lineRule="auto"/>
       </w:pPr>
-      <w:rPr/>
       <w:tblPr/>
       <w:tcPr>
         <w:tcBorders>
@@ -15197,7 +15629,6 @@
       <w:pPr>
         <w:spacing w:before="0" w:after="0" w:line="240" w:lineRule="auto"/>
       </w:pPr>
-      <w:rPr/>
       <w:tblPr/>
       <w:tcPr>
         <w:tcBorders>
@@ -15343,7 +15774,6 @@
       <w:pPr>
         <w:spacing w:before="0" w:after="0" w:line="240" w:lineRule="auto"/>
       </w:pPr>
-      <w:rPr/>
       <w:tblPr/>
       <w:tcPr>
         <w:tcBorders>
@@ -22076,34 +22506,34 @@
         <a:srgbClr val="000000"/>
       </a:dk1>
       <a:lt1>
-        <a:srgbClr val="ffffff"/>
+        <a:srgbClr val="FFFFFF"/>
       </a:lt1>
       <a:dk2>
-        <a:srgbClr val="1f497d"/>
+        <a:srgbClr val="1F497D"/>
       </a:dk2>
       <a:lt2>
-        <a:srgbClr val="eeece1"/>
+        <a:srgbClr val="EEECE1"/>
       </a:lt2>
       <a:accent1>
-        <a:srgbClr val="4f81bd"/>
+        <a:srgbClr val="4F81BD"/>
       </a:accent1>
       <a:accent2>
-        <a:srgbClr val="c0504d"/>
+        <a:srgbClr val="C0504D"/>
       </a:accent2>
       <a:accent3>
-        <a:srgbClr val="9bbb59"/>
+        <a:srgbClr val="9BBB59"/>
       </a:accent3>
       <a:accent4>
-        <a:srgbClr val="8064a2"/>
+        <a:srgbClr val="8064A2"/>
       </a:accent4>
       <a:accent5>
-        <a:srgbClr val="4bacc6"/>
+        <a:srgbClr val="4BACC6"/>
       </a:accent5>
       <a:accent6>
-        <a:srgbClr val="f79646"/>
+        <a:srgbClr val="F79646"/>
       </a:accent6>
       <a:hlink>
-        <a:srgbClr val="0000ff"/>
+        <a:srgbClr val="0000FF"/>
       </a:hlink>
       <a:folHlink>
         <a:srgbClr val="800080"/>

</xml_diff>